<commit_message>
Ajustes en la documentación
</commit_message>
<xml_diff>
--- a/PuntoDeCorte-AimaraYDiana.docx
+++ b/PuntoDeCorte-AimaraYDiana.docx
@@ -1,6 +1,6 @@
 
 <file path=word/document.xml><?xml version="1.0" encoding="utf-8"?>
-<w:document xmlns:wpc="http://schemas.microsoft.com/office/word/2010/wordprocessingCanvas" xmlns:cx="http://schemas.microsoft.com/office/drawing/2014/chartex" xmlns:cx1="http://schemas.microsoft.com/office/drawing/2015/9/8/chartex" xmlns:cx2="http://schemas.microsoft.com/office/drawing/2015/10/21/chartex" xmlns:cx3="http://schemas.microsoft.com/office/drawing/2016/5/9/chartex" xmlns:cx4="http://schemas.microsoft.com/office/drawing/2016/5/10/chartex" xmlns:cx5="http://schemas.microsoft.com/office/drawing/2016/5/11/chartex" xmlns:cx6="http://schemas.microsoft.com/office/drawing/2016/5/12/chartex" xmlns:cx7="http://schemas.microsoft.com/office/drawing/2016/5/13/chartex" xmlns:cx8="http://schemas.microsoft.com/office/drawing/2016/5/14/chartex" xmlns:mc="http://schemas.openxmlformats.org/markup-compatibility/2006" xmlns:aink="http://schemas.microsoft.com/office/drawing/2016/ink" xmlns:am3d="http://schemas.microsoft.com/office/drawing/2017/model3d" xmlns:o="urn:schemas-microsoft-com:office:office" xmlns:oel="http://schemas.microsoft.com/office/2019/extlst" xmlns:r="http://schemas.openxmlformats.org/officeDocument/2006/relationships" xmlns:m="http://schemas.openxmlformats.org/officeDocument/2006/math" xmlns:v="urn:schemas-microsoft-com:vml" xmlns:wp14="http://schemas.microsoft.com/office/word/2010/wordprocessingDrawing" xmlns:wp="http://schemas.openxmlformats.org/drawingml/2006/wordprocessingDrawing" xmlns:w10="urn:schemas-microsoft-com:office:word" xmlns:w="http://schemas.openxmlformats.org/wordprocessingml/2006/main" xmlns:w14="http://schemas.microsoft.com/office/word/2010/wordml" xmlns:w15="http://schemas.microsoft.com/office/word/2012/wordml" xmlns:w16cex="http://schemas.microsoft.com/office/word/2018/wordml/cex" xmlns:w16cid="http://schemas.microsoft.com/office/word/2016/wordml/cid" xmlns:w16="http://schemas.microsoft.com/office/word/2018/wordml" xmlns:w16du="http://schemas.microsoft.com/office/word/2023/wordml/word16du" xmlns:w16sdtdh="http://schemas.microsoft.com/office/word/2020/wordml/sdtdatahash" xmlns:w16sdtfl="http://schemas.microsoft.com/office/word/2024/wordml/sdtformatlock" xmlns:w16se="http://schemas.microsoft.com/office/word/2015/wordml/symex" xmlns:wpg="http://schemas.microsoft.com/office/word/2010/wordprocessingGroup" xmlns:wpi="http://schemas.microsoft.com/office/word/2010/wordprocessingInk" xmlns:wne="http://schemas.microsoft.com/office/word/2006/wordml" xmlns:wps="http://schemas.microsoft.com/office/word/2010/wordprocessingShape" mc:Ignorable="w14 w15 w16se w16cid w16 w16cex w16sdtdh w16sdtfl w16du wp14">
+<w:document xmlns:wpc="http://schemas.microsoft.com/office/word/2010/wordprocessingCanvas" xmlns:cx="http://schemas.microsoft.com/office/drawing/2014/chartex" xmlns:cx1="http://schemas.microsoft.com/office/drawing/2015/9/8/chartex" xmlns:cx2="http://schemas.microsoft.com/office/drawing/2015/10/21/chartex" xmlns:cx3="http://schemas.microsoft.com/office/drawing/2016/5/9/chartex" xmlns:cx4="http://schemas.microsoft.com/office/drawing/2016/5/10/chartex" xmlns:cx5="http://schemas.microsoft.com/office/drawing/2016/5/11/chartex" xmlns:cx6="http://schemas.microsoft.com/office/drawing/2016/5/12/chartex" xmlns:cx7="http://schemas.microsoft.com/office/drawing/2016/5/13/chartex" xmlns:cx8="http://schemas.microsoft.com/office/drawing/2016/5/14/chartex" xmlns:mc="http://schemas.openxmlformats.org/markup-compatibility/2006" xmlns:aink="http://schemas.microsoft.com/office/drawing/2016/ink" xmlns:am3d="http://schemas.microsoft.com/office/drawing/2017/model3d" xmlns:o="urn:schemas-microsoft-com:office:office" xmlns:r="http://schemas.openxmlformats.org/officeDocument/2006/relationships" xmlns:m="http://schemas.openxmlformats.org/officeDocument/2006/math" xmlns:v="urn:schemas-microsoft-com:vml" xmlns:wp14="http://schemas.microsoft.com/office/word/2010/wordprocessingDrawing" xmlns:wp="http://schemas.openxmlformats.org/drawingml/2006/wordprocessingDrawing" xmlns:w10="urn:schemas-microsoft-com:office:word" xmlns:w="http://schemas.openxmlformats.org/wordprocessingml/2006/main" xmlns:w14="http://schemas.microsoft.com/office/word/2010/wordml" xmlns:w15="http://schemas.microsoft.com/office/word/2012/wordml" xmlns:w16cid="http://schemas.microsoft.com/office/word/2016/wordml/cid" xmlns:w16se="http://schemas.microsoft.com/office/word/2015/wordml/symex" xmlns:wpg="http://schemas.microsoft.com/office/word/2010/wordprocessingGroup" xmlns:wpi="http://schemas.microsoft.com/office/word/2010/wordprocessingInk" xmlns:wne="http://schemas.microsoft.com/office/word/2006/wordml" xmlns:wps="http://schemas.microsoft.com/office/word/2010/wordprocessingShape" mc:Ignorable="w14 w15 w16se w16cid wp14">
   <w:body>
     <w:sdt>
       <w:sdtPr>
@@ -10,6 +10,7 @@
           <w:docPartUnique/>
         </w:docPartObj>
       </w:sdtPr>
+      <w:sdtEndPr/>
       <w:sdtContent>
         <w:p>
           <w:r>
@@ -186,6 +187,7 @@
                                     <w:dataBinding w:prefixMappings="xmlns:ns0='http://purl.org/dc/elements/1.1/' xmlns:ns1='http://schemas.openxmlformats.org/package/2006/metadata/core-properties' " w:xpath="/ns1:coreProperties[1]/ns0:title[1]" w:storeItemID="{6C3C8BC8-F283-45AE-878A-BAB7291924A1}"/>
                                     <w:text/>
                                   </w:sdtPr>
+                                  <w:sdtEndPr/>
                                   <w:sdtContent>
                                     <w:r>
                                       <w:rPr>
@@ -213,6 +215,7 @@
                                   <w:dataBinding w:prefixMappings="xmlns:ns0='http://purl.org/dc/elements/1.1/' xmlns:ns1='http://schemas.openxmlformats.org/package/2006/metadata/core-properties' " w:xpath="/ns1:coreProperties[1]/ns0:subject[1]" w:storeItemID="{6C3C8BC8-F283-45AE-878A-BAB7291924A1}"/>
                                   <w:text/>
                                 </w:sdtPr>
+                                <w:sdtEndPr/>
                                 <w:sdtContent>
                                   <w:p>
                                     <w:pPr>
@@ -251,6 +254,7 @@
                                   <w:dataBinding w:prefixMappings="xmlns:ns0='http://purl.org/dc/elements/1.1/' xmlns:ns1='http://schemas.openxmlformats.org/package/2006/metadata/core-properties' " w:xpath="/ns1:coreProperties[1]/ns0:creator[1]" w:storeItemID="{6C3C8BC8-F283-45AE-878A-BAB7291924A1}"/>
                                   <w:text/>
                                 </w:sdtPr>
+                                <w:sdtEndPr/>
                                 <w:sdtContent>
                                   <w:p>
                                     <w:pPr>
@@ -301,7 +305,7 @@
                     <v:stroke joinstyle="miter"/>
                     <v:path gradientshapeok="t" o:connecttype="rect"/>
                   </v:shapetype>
-                  <v:shape id="Cuadro de texto 131" o:spid="_x0000_s1026" type="#_x0000_t202" style="position:absolute;margin-left:0;margin-top:0;width:369pt;height:529.2pt;z-index:251660288;visibility:visible;mso-wrap-style:square;mso-width-percent:790;mso-height-percent:350;mso-left-percent:77;mso-top-percent:540;mso-wrap-distance-left:14.4pt;mso-wrap-distance-top:0;mso-wrap-distance-right:14.4pt;mso-wrap-distance-bottom:0;mso-position-horizontal-relative:margin;mso-position-vertical-relative:page;mso-width-percent:790;mso-height-percent:350;mso-left-percent:77;mso-top-percent:540;mso-width-relative:margin;mso-height-relative:page;v-text-anchor:top" o:gfxdata="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" filled="f" stroked="f" strokeweight=".5pt">
+                  <v:shape id="Cuadro de texto 131" o:spid="_x0000_s1026" type="#_x0000_t202" style="position:absolute;margin-left:0;margin-top:0;width:369pt;height:529.2pt;z-index:251660288;visibility:visible;mso-wrap-style:square;mso-width-percent:790;mso-height-percent:350;mso-left-percent:77;mso-top-percent:540;mso-wrap-distance-left:14.4pt;mso-wrap-distance-top:0;mso-wrap-distance-right:14.4pt;mso-wrap-distance-bottom:0;mso-position-horizontal-relative:margin;mso-position-vertical-relative:page;mso-width-percent:790;mso-height-percent:350;mso-left-percent:77;mso-top-percent:540;mso-width-relative:margin;mso-height-relative:page;v-text-anchor:top" o:gfxdata="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" filled="f" stroked="f" strokeweight=".5pt">
                     <v:textbox style="mso-fit-shape-to-text:t" inset="0,0,0,0">
                       <w:txbxContent>
                         <w:p>
@@ -328,6 +332,7 @@
                               <w:dataBinding w:prefixMappings="xmlns:ns0='http://purl.org/dc/elements/1.1/' xmlns:ns1='http://schemas.openxmlformats.org/package/2006/metadata/core-properties' " w:xpath="/ns1:coreProperties[1]/ns0:title[1]" w:storeItemID="{6C3C8BC8-F283-45AE-878A-BAB7291924A1}"/>
                               <w:text/>
                             </w:sdtPr>
+                            <w:sdtEndPr/>
                             <w:sdtContent>
                               <w:r>
                                 <w:rPr>
@@ -355,6 +360,7 @@
                             <w:dataBinding w:prefixMappings="xmlns:ns0='http://purl.org/dc/elements/1.1/' xmlns:ns1='http://schemas.openxmlformats.org/package/2006/metadata/core-properties' " w:xpath="/ns1:coreProperties[1]/ns0:subject[1]" w:storeItemID="{6C3C8BC8-F283-45AE-878A-BAB7291924A1}"/>
                             <w:text/>
                           </w:sdtPr>
+                          <w:sdtEndPr/>
                           <w:sdtContent>
                             <w:p>
                               <w:pPr>
@@ -393,6 +399,7 @@
                             <w:dataBinding w:prefixMappings="xmlns:ns0='http://purl.org/dc/elements/1.1/' xmlns:ns1='http://schemas.openxmlformats.org/package/2006/metadata/core-properties' " w:xpath="/ns1:coreProperties[1]/ns0:creator[1]" w:storeItemID="{6C3C8BC8-F283-45AE-878A-BAB7291924A1}"/>
                             <w:text/>
                           </w:sdtPr>
+                          <w:sdtEndPr/>
                           <w:sdtContent>
                             <w:p>
                               <w:pPr>
@@ -433,6 +440,15 @@
     </w:sdt>
     <w:sdt>
       <w:sdtPr>
+        <w:rPr>
+          <w:rFonts w:asciiTheme="minorHAnsi" w:eastAsiaTheme="minorHAnsi" w:hAnsiTheme="minorHAnsi" w:cstheme="minorBidi"/>
+          <w:color w:val="auto"/>
+          <w:kern w:val="2"/>
+          <w:sz w:val="24"/>
+          <w:szCs w:val="24"/>
+          <w:lang w:eastAsia="en-US"/>
+          <w14:ligatures w14:val="standardContextual"/>
+        </w:rPr>
         <w:id w:val="-367832095"/>
         <w:docPartObj>
           <w:docPartGallery w:val="Table of Contents"/>
@@ -441,15 +457,8 @@
       </w:sdtPr>
       <w:sdtEndPr>
         <w:rPr>
-          <w:rFonts w:asciiTheme="minorHAnsi" w:eastAsiaTheme="minorHAnsi" w:hAnsiTheme="minorHAnsi" w:cstheme="minorBidi"/>
           <w:b/>
           <w:bCs/>
-          <w:color w:val="auto"/>
-          <w:kern w:val="2"/>
-          <w:sz w:val="24"/>
-          <w:szCs w:val="24"/>
-          <w:lang w:eastAsia="en-US"/>
-          <w14:ligatures w14:val="standardContextual"/>
         </w:rPr>
       </w:sdtEndPr>
       <w:sdtContent>
@@ -1717,13 +1726,15 @@
         <w:tblLook w:val="04A0" w:firstRow="1" w:lastRow="0" w:firstColumn="1" w:lastColumn="0" w:noHBand="0" w:noVBand="1"/>
       </w:tblPr>
       <w:tblGrid>
-        <w:gridCol w:w="4247"/>
-        <w:gridCol w:w="4247"/>
+        <w:gridCol w:w="4432"/>
       </w:tblGrid>
       <w:tr>
+        <w:trPr>
+          <w:trHeight w:val="2235"/>
+        </w:trPr>
         <w:tc>
           <w:tcPr>
-            <w:tcW w:w="4247" w:type="dxa"/>
+            <w:tcW w:w="4432" w:type="dxa"/>
           </w:tcPr>
           <w:p>
             <w:pPr>
@@ -1774,7 +1785,7 @@
               <w:rPr>
                 <w:rFonts w:ascii="Arial" w:hAnsi="Arial" w:cs="Arial"/>
               </w:rPr>
-              <w:t>Gestión del aprendizaje</w:t>
+              <w:t>Analítica de datos</w:t>
             </w:r>
           </w:p>
           <w:p>
@@ -1801,89 +1812,6 @@
                 <w:rFonts w:ascii="Arial" w:hAnsi="Arial" w:cs="Arial"/>
               </w:rPr>
               <w:t>Experiencia de usuario (UX)</w:t>
-            </w:r>
-          </w:p>
-        </w:tc>
-        <w:tc>
-          <w:tcPr>
-            <w:tcW w:w="4247" w:type="dxa"/>
-          </w:tcPr>
-          <w:p>
-            <w:pPr>
-              <w:rPr>
-                <w:rFonts w:ascii="Arial" w:hAnsi="Arial" w:cs="Arial"/>
-              </w:rPr>
-            </w:pPr>
-            <w:r>
-              <w:rPr>
-                <w:rFonts w:ascii="Arial" w:hAnsi="Arial" w:cs="Arial"/>
-              </w:rPr>
-              <w:t>Oposiciones</w:t>
-            </w:r>
-          </w:p>
-          <w:p>
-            <w:pPr>
-              <w:rPr>
-                <w:rFonts w:ascii="Arial" w:hAnsi="Arial" w:cs="Arial"/>
-              </w:rPr>
-            </w:pPr>
-            <w:r>
-              <w:rPr>
-                <w:rFonts w:ascii="Arial" w:hAnsi="Arial" w:cs="Arial"/>
-              </w:rPr>
-              <w:t>Aplicación web</w:t>
-            </w:r>
-          </w:p>
-          <w:p>
-            <w:pPr>
-              <w:rPr>
-                <w:rFonts w:ascii="Arial" w:hAnsi="Arial" w:cs="Arial"/>
-              </w:rPr>
-            </w:pPr>
-            <w:r>
-              <w:rPr>
-                <w:rFonts w:ascii="Arial" w:hAnsi="Arial" w:cs="Arial"/>
-              </w:rPr>
-              <w:t>Aprendizaje digital</w:t>
-            </w:r>
-          </w:p>
-          <w:p>
-            <w:pPr>
-              <w:rPr>
-                <w:rFonts w:ascii="Arial" w:hAnsi="Arial" w:cs="Arial"/>
-              </w:rPr>
-            </w:pPr>
-            <w:r>
-              <w:rPr>
-                <w:rFonts w:ascii="Arial" w:hAnsi="Arial" w:cs="Arial"/>
-              </w:rPr>
-              <w:t>Analítica de datos</w:t>
-            </w:r>
-          </w:p>
-          <w:p>
-            <w:pPr>
-              <w:rPr>
-                <w:rFonts w:ascii="Arial" w:hAnsi="Arial" w:cs="Arial"/>
-              </w:rPr>
-            </w:pPr>
-            <w:r>
-              <w:rPr>
-                <w:rFonts w:ascii="Arial" w:hAnsi="Arial" w:cs="Arial"/>
-              </w:rPr>
-              <w:t>SaaS</w:t>
-            </w:r>
-          </w:p>
-          <w:p>
-            <w:pPr>
-              <w:rPr>
-                <w:rFonts w:ascii="Arial" w:hAnsi="Arial" w:cs="Arial"/>
-              </w:rPr>
-            </w:pPr>
-            <w:r>
-              <w:rPr>
-                <w:rFonts w:ascii="Arial" w:hAnsi="Arial" w:cs="Arial"/>
-              </w:rPr>
-              <w:t>UX</w:t>
             </w:r>
           </w:p>
         </w:tc>
@@ -1949,43 +1877,7 @@
         <w:rPr>
           <w:rFonts w:ascii="Arial" w:hAnsi="Arial" w:cs="Arial"/>
         </w:rPr>
-        <w:t>Actualmente, los opositores deben recurrir a múltiples herramientas digitales para gestionar su estudio, como plataformas de academias</w:t>
-      </w:r>
-      <w:r>
-        <w:rPr>
-          <w:rFonts w:ascii="Arial" w:hAnsi="Arial" w:cs="Arial"/>
-        </w:rPr>
-        <w:t>,</w:t>
-      </w:r>
-      <w:r>
-        <w:rPr>
-          <w:rFonts w:ascii="Arial" w:hAnsi="Arial" w:cs="Arial"/>
-        </w:rPr>
-        <w:t xml:space="preserve"> aplicaciones de memorización como Anki, herramientas de concentración (Pomodoro, Forest), </w:t>
-      </w:r>
-      <w:r>
-        <w:rPr>
-          <w:rFonts w:ascii="Arial" w:hAnsi="Arial" w:cs="Arial"/>
-        </w:rPr>
-        <w:t>e incluso</w:t>
-      </w:r>
-      <w:r>
-        <w:rPr>
-          <w:rFonts w:ascii="Arial" w:hAnsi="Arial" w:cs="Arial"/>
-        </w:rPr>
-        <w:t xml:space="preserve"> hojas de cálculo </w:t>
-      </w:r>
-      <w:r>
-        <w:rPr>
-          <w:rFonts w:ascii="Arial" w:hAnsi="Arial" w:cs="Arial"/>
-        </w:rPr>
-        <w:t xml:space="preserve">de elaboración </w:t>
-      </w:r>
-      <w:r>
-        <w:rPr>
-          <w:rFonts w:ascii="Arial" w:hAnsi="Arial" w:cs="Arial"/>
-        </w:rPr>
-        <w:t>propia para el seguimiento del rendimiento.</w:t>
+        <w:t>Actualmente, los opositores deben recurrir a múltiples herramientas digitales para gestionar su estudio, como plataformas de academias, aplicaciones de memorización como Anki, herramientas de concentración (Pomodoro, Forest), e incluso hojas de cálculo de elaboración propia para el seguimiento del rendimiento.</w:t>
       </w:r>
     </w:p>
     <w:p>
@@ -2128,7 +2020,6 @@
         <w:rPr>
           <w:rFonts w:ascii="Arial" w:hAnsi="Arial" w:cs="Arial"/>
         </w:rPr>
-        <w:lastRenderedPageBreak/>
         <w:t>Por otro lado, las academias tampoco disponen habitualmente de soluciones tecnológicas integrales que les permitan:</w:t>
       </w:r>
     </w:p>
@@ -2243,13 +2134,7 @@
         <w:rPr>
           <w:rFonts w:ascii="Arial" w:hAnsi="Arial" w:cs="Arial"/>
         </w:rPr>
-        <w:t xml:space="preserve"> proyecto responde a la creciente digitalización del sector educativo y a la necesidad de incorporar soluciones tecnológicas que optimicen los procesos de aprendizaje y seguimiento.</w:t>
-      </w:r>
-      <w:r>
-        <w:rPr>
-          <w:rFonts w:ascii="Arial" w:hAnsi="Arial" w:cs="Arial"/>
-        </w:rPr>
-        <w:t xml:space="preserve"> </w:t>
+        <w:t xml:space="preserve"> proyecto responde a la creciente digitalización del sector educativo y a la necesidad de incorporar soluciones tecnológicas que optimicen los procesos de aprendizaje y seguimiento. </w:t>
       </w:r>
     </w:p>
     <w:p/>
@@ -2275,13 +2160,7 @@
         <w:rPr>
           <w:rFonts w:ascii="Arial" w:hAnsi="Arial" w:cs="Arial"/>
         </w:rPr>
-        <w:t>Nuestro</w:t>
-      </w:r>
-      <w:r>
-        <w:rPr>
-          <w:rFonts w:ascii="Arial" w:hAnsi="Arial" w:cs="Arial"/>
-        </w:rPr>
-        <w:t xml:space="preserve"> proyecto se sitúa en el contexto del sistema de oposiciones en España, caracterizado por un alto nivel de exigencia y una preparación prolongada en el tiempo.</w:t>
+        <w:t>Nuestro proyecto se sitúa en el contexto del sistema de oposiciones en España, caracterizado por un alto nivel de exigencia y una preparación prolongada en el tiempo.</w:t>
       </w:r>
     </w:p>
     <w:p>
@@ -2444,6 +2323,7 @@
         <w:rPr>
           <w:rFonts w:ascii="Arial" w:hAnsi="Arial" w:cs="Arial"/>
         </w:rPr>
+        <w:lastRenderedPageBreak/>
         <w:t>El usuario accede a la aplicación para:</w:t>
       </w:r>
     </w:p>
@@ -2464,7 +2344,6 @@
         <w:rPr>
           <w:rFonts w:ascii="Arial" w:hAnsi="Arial" w:cs="Arial"/>
         </w:rPr>
-        <w:lastRenderedPageBreak/>
         <w:t>Organizar su material de estudio.</w:t>
       </w:r>
     </w:p>
@@ -2917,6 +2796,7 @@
       </w:pPr>
       <w:bookmarkStart w:id="5" w:name="_Toc226219486"/>
       <w:r>
+        <w:lastRenderedPageBreak/>
         <w:t>Marco profesional y relevancia en el sector</w:t>
       </w:r>
       <w:bookmarkEnd w:id="5"/>
@@ -2951,7 +2831,6 @@
         <w:rPr>
           <w:rFonts w:ascii="Arial" w:hAnsi="Arial" w:cs="Arial"/>
         </w:rPr>
-        <w:lastRenderedPageBreak/>
         <w:t>Actualmente, el mercado presenta las siguientes características:</w:t>
       </w:r>
     </w:p>
@@ -3012,19 +2891,7 @@
         <w:rPr>
           <w:rFonts w:ascii="Arial" w:hAnsi="Arial" w:cs="Arial"/>
         </w:rPr>
-        <w:t>Existencia de herramientas especializadas</w:t>
-      </w:r>
-      <w:r>
-        <w:rPr>
-          <w:rFonts w:ascii="Arial" w:hAnsi="Arial" w:cs="Arial"/>
-        </w:rPr>
-        <w:t>,</w:t>
-      </w:r>
-      <w:r>
-        <w:rPr>
-          <w:rFonts w:ascii="Arial" w:hAnsi="Arial" w:cs="Arial"/>
-        </w:rPr>
-        <w:t xml:space="preserve"> pero no integradas.</w:t>
+        <w:t>Existencia de herramientas especializadas, pero no integradas.</w:t>
       </w:r>
     </w:p>
     <w:p>
@@ -3274,6 +3141,33 @@
         <w:jc w:val="both"/>
         <w:rPr>
           <w:rFonts w:ascii="Arial" w:hAnsi="Arial" w:cs="Arial"/>
+        </w:rPr>
+      </w:pPr>
+    </w:p>
+    <w:p>
+      <w:pPr>
+        <w:spacing w:line="360" w:lineRule="auto"/>
+        <w:jc w:val="both"/>
+        <w:rPr>
+          <w:rFonts w:ascii="Arial" w:hAnsi="Arial" w:cs="Arial"/>
+        </w:rPr>
+      </w:pPr>
+    </w:p>
+    <w:p>
+      <w:pPr>
+        <w:spacing w:line="360" w:lineRule="auto"/>
+        <w:jc w:val="both"/>
+        <w:rPr>
+          <w:rFonts w:ascii="Arial" w:hAnsi="Arial" w:cs="Arial"/>
+        </w:rPr>
+      </w:pPr>
+    </w:p>
+    <w:p>
+      <w:pPr>
+        <w:spacing w:line="360" w:lineRule="auto"/>
+        <w:jc w:val="both"/>
+        <w:rPr>
+          <w:rFonts w:ascii="Arial" w:hAnsi="Arial" w:cs="Arial"/>
           <w:b/>
           <w:bCs/>
           <w:color w:val="215E99" w:themeColor="text2" w:themeTint="BF"/>
@@ -3286,6 +3180,7 @@
           <w:bCs/>
           <w:color w:val="215E99" w:themeColor="text2" w:themeTint="BF"/>
         </w:rPr>
+        <w:lastRenderedPageBreak/>
         <w:t>Análisis DAFO</w:t>
       </w:r>
     </w:p>
@@ -3299,14 +3194,14 @@
       </w:pPr>
       <w:r>
         <w:rPr>
+          <w:rFonts w:ascii="Arial" w:hAnsi="Arial" w:cs="Arial"/>
           <w:noProof/>
         </w:rPr>
-        <w:lastRenderedPageBreak/>
         <w:drawing>
-          <wp:inline distT="0" distB="0" distL="0" distR="0" wp14:anchorId="64F5917C" wp14:editId="6C6502C0">
-            <wp:extent cx="5400040" cy="4050030"/>
-            <wp:effectExtent l="0" t="0" r="0" b="7620"/>
-            <wp:docPr id="821629926" name="Imagen 2"/>
+          <wp:inline distT="0" distB="0" distL="0" distR="0" wp14:anchorId="38FE6B83" wp14:editId="1740A537">
+            <wp:extent cx="5547360" cy="4160520"/>
+            <wp:effectExtent l="0" t="0" r="0" b="0"/>
+            <wp:docPr id="1" name="Imagen 1"/>
             <wp:cNvGraphicFramePr>
               <a:graphicFrameLocks xmlns:a="http://schemas.openxmlformats.org/drawingml/2006/main" noChangeAspect="1"/>
             </wp:cNvGraphicFramePr>
@@ -3314,10 +3209,8 @@
               <a:graphicData uri="http://schemas.openxmlformats.org/drawingml/2006/picture">
                 <pic:pic xmlns:pic="http://schemas.openxmlformats.org/drawingml/2006/picture">
                   <pic:nvPicPr>
-                    <pic:cNvPr id="0" name="Picture 3"/>
-                    <pic:cNvPicPr>
-                      <a:picLocks noChangeAspect="1" noChangeArrowheads="1"/>
-                    </pic:cNvPicPr>
+                    <pic:cNvPr id="1" name="Análisis DAFO - Punto De Corte.png"/>
+                    <pic:cNvPicPr/>
                   </pic:nvPicPr>
                   <pic:blipFill>
                     <a:blip r:embed="rId9">
@@ -3327,23 +3220,18 @@
                         </a:ext>
                       </a:extLst>
                     </a:blip>
-                    <a:srcRect/>
                     <a:stretch>
                       <a:fillRect/>
                     </a:stretch>
                   </pic:blipFill>
-                  <pic:spPr bwMode="auto">
+                  <pic:spPr>
                     <a:xfrm>
                       <a:off x="0" y="0"/>
-                      <a:ext cx="5400040" cy="4050030"/>
+                      <a:ext cx="5547360" cy="4160520"/>
                     </a:xfrm>
                     <a:prstGeom prst="rect">
                       <a:avLst/>
                     </a:prstGeom>
-                    <a:noFill/>
-                    <a:ln>
-                      <a:noFill/>
-                    </a:ln>
                   </pic:spPr>
                 </pic:pic>
               </a:graphicData>
@@ -3374,132 +3262,23 @@
           <w:rFonts w:ascii="Arial" w:hAnsi="Arial" w:cs="Arial"/>
           <w:highlight w:val="yellow"/>
         </w:rPr>
-        <w:t>PTE. REVISAR:</w:t>
-      </w:r>
-    </w:p>
-    <w:p>
-      <w:pPr>
-        <w:pStyle w:val="Prrafodelista"/>
-        <w:numPr>
-          <w:ilvl w:val="0"/>
-          <w:numId w:val="11"/>
-        </w:numPr>
-        <w:spacing w:line="360" w:lineRule="auto"/>
-        <w:jc w:val="both"/>
-        <w:rPr>
-          <w:rFonts w:ascii="Arial" w:hAnsi="Arial" w:cs="Arial"/>
-        </w:rPr>
-      </w:pPr>
-      <w:r>
-        <w:rPr>
-          <w:rFonts w:ascii="Arial" w:hAnsi="Arial" w:cs="Arial"/>
-        </w:rPr>
-        <w:t>Riesgo de dispersión (DEBILIDADES).</w:t>
-      </w:r>
-    </w:p>
-    <w:p>
-      <w:pPr>
-        <w:pStyle w:val="Prrafodelista"/>
-        <w:numPr>
-          <w:ilvl w:val="0"/>
-          <w:numId w:val="11"/>
-        </w:numPr>
-        <w:spacing w:line="360" w:lineRule="auto"/>
-        <w:jc w:val="both"/>
-        <w:rPr>
-          <w:rFonts w:ascii="Arial" w:hAnsi="Arial" w:cs="Arial"/>
-        </w:rPr>
-      </w:pPr>
-      <w:r>
-        <w:rPr>
-          <w:rFonts w:ascii="Arial" w:hAnsi="Arial" w:cs="Arial"/>
-        </w:rPr>
-        <w:t>Modelo free + (Eliminar parte, no es gratis para academias) FORTALEZAS</w:t>
-      </w:r>
-    </w:p>
-    <w:p>
-      <w:pPr>
-        <w:pStyle w:val="Prrafodelista"/>
-        <w:numPr>
-          <w:ilvl w:val="0"/>
-          <w:numId w:val="11"/>
-        </w:numPr>
-        <w:spacing w:line="360" w:lineRule="auto"/>
-        <w:jc w:val="both"/>
-        <w:rPr>
-          <w:rFonts w:ascii="Arial" w:hAnsi="Arial" w:cs="Arial"/>
-        </w:rPr>
-      </w:pPr>
-      <w:r>
-        <w:rPr>
-          <w:rFonts w:ascii="Arial" w:hAnsi="Arial" w:cs="Arial"/>
-        </w:rPr>
-        <w:t>Udemy- seguridad?¿ AMENAZAS</w:t>
-      </w:r>
-    </w:p>
-    <w:p>
-      <w:pPr>
-        <w:pStyle w:val="Prrafodelista"/>
-        <w:numPr>
-          <w:ilvl w:val="0"/>
-          <w:numId w:val="11"/>
-        </w:numPr>
-        <w:spacing w:line="360" w:lineRule="auto"/>
-        <w:jc w:val="both"/>
-        <w:rPr>
-          <w:rFonts w:ascii="Arial" w:hAnsi="Arial" w:cs="Arial"/>
-        </w:rPr>
-      </w:pPr>
-      <w:r>
-        <w:rPr>
-          <w:rFonts w:ascii="Arial" w:hAnsi="Arial" w:cs="Arial"/>
-        </w:rPr>
-        <w:t>Especializada… por ahora, especializada en cada oposición en el futuro. OPORTUNIDADES.</w:t>
-      </w:r>
-    </w:p>
-    <w:p>
-      <w:pPr>
-        <w:pStyle w:val="Prrafodelista"/>
-        <w:numPr>
-          <w:ilvl w:val="0"/>
-          <w:numId w:val="11"/>
-        </w:numPr>
-        <w:spacing w:line="360" w:lineRule="auto"/>
-        <w:jc w:val="both"/>
-        <w:rPr>
-          <w:rFonts w:ascii="Arial" w:hAnsi="Arial" w:cs="Arial"/>
-        </w:rPr>
-      </w:pPr>
-      <w:r>
-        <w:rPr>
-          <w:rFonts w:ascii="Arial" w:hAnsi="Arial" w:cs="Arial"/>
-        </w:rPr>
-        <w:t>A otras oposiciones SIMILARES - OPORTUNNIDADES</w:t>
-      </w:r>
-    </w:p>
-    <w:p>
-      <w:pPr>
-        <w:spacing w:line="360" w:lineRule="auto"/>
-        <w:jc w:val="both"/>
-        <w:rPr>
-          <w:rFonts w:ascii="Arial" w:hAnsi="Arial" w:cs="Arial"/>
-        </w:rPr>
-      </w:pPr>
-    </w:p>
-    <w:p>
-      <w:pPr>
-        <w:spacing w:line="360" w:lineRule="auto"/>
-        <w:jc w:val="both"/>
-        <w:rPr>
-          <w:rFonts w:ascii="Arial" w:hAnsi="Arial" w:cs="Arial"/>
-        </w:rPr>
-      </w:pPr>
+        <w:t xml:space="preserve">Extra de la </w:t>
+      </w:r>
+      <w:proofErr w:type="spellStart"/>
       <w:r>
         <w:rPr>
           <w:rFonts w:ascii="Arial" w:hAnsi="Arial" w:cs="Arial"/>
           <w:highlight w:val="yellow"/>
         </w:rPr>
-        <w:t>Extra de la chati:</w:t>
+        <w:t>chati</w:t>
+      </w:r>
+      <w:proofErr w:type="spellEnd"/>
+      <w:r>
+        <w:rPr>
+          <w:rFonts w:ascii="Arial" w:hAnsi="Arial" w:cs="Arial"/>
+          <w:highlight w:val="yellow"/>
+        </w:rPr>
+        <w:t>:</w:t>
       </w:r>
     </w:p>
     <w:p>
@@ -3512,12 +3291,6 @@
           <w:bCs/>
         </w:rPr>
       </w:pPr>
-      <w:r>
-        <w:rPr>
-          <w:rFonts w:ascii="Arial" w:hAnsi="Arial" w:cs="Arial"/>
-        </w:rPr>
-        <w:br/>
-      </w:r>
       <w:r>
         <w:rPr>
           <w:rFonts w:ascii="Arial" w:hAnsi="Arial" w:cs="Arial"/>
@@ -3576,7 +3349,6 @@
         <w:rPr>
           <w:rFonts w:ascii="Arial" w:hAnsi="Arial" w:cs="Arial"/>
         </w:rPr>
-        <w:lastRenderedPageBreak/>
         <w:t xml:space="preserve">Enfoque dual: opositor individual + academias. </w:t>
       </w:r>
     </w:p>
@@ -3699,6 +3471,7 @@
         <w:rPr>
           <w:rFonts w:ascii="Arial" w:hAnsi="Arial" w:cs="Arial"/>
         </w:rPr>
+        <w:lastRenderedPageBreak/>
         <w:t xml:space="preserve">Dependencia inicial de adopción por parte de academias. </w:t>
       </w:r>
     </w:p>
@@ -3971,15 +3744,6 @@
         <w:jc w:val="both"/>
         <w:rPr>
           <w:rFonts w:ascii="Arial" w:hAnsi="Arial" w:cs="Arial"/>
-        </w:rPr>
-      </w:pPr>
-    </w:p>
-    <w:p>
-      <w:pPr>
-        <w:spacing w:line="360" w:lineRule="auto"/>
-        <w:jc w:val="both"/>
-        <w:rPr>
-          <w:rFonts w:ascii="Arial" w:hAnsi="Arial" w:cs="Arial"/>
           <w:b/>
           <w:bCs/>
           <w:color w:val="215E99" w:themeColor="text2" w:themeTint="BF"/>
@@ -4034,7 +3798,6 @@
         <w:rPr>
           <w:rFonts w:ascii="Arial" w:hAnsi="Arial" w:cs="Arial"/>
         </w:rPr>
-        <w:lastRenderedPageBreak/>
         <w:t>Nuestro Proyecto</w:t>
       </w:r>
       <w:r>
@@ -4125,6 +3888,7 @@
         <w:rPr>
           <w:rFonts w:ascii="Arial" w:hAnsi="Arial" w:cs="Arial"/>
         </w:rPr>
+        <w:lastRenderedPageBreak/>
         <w:t>La propuesta de valor se basa en:</w:t>
       </w:r>
     </w:p>
@@ -4355,7 +4119,7 @@
         <w:spacing w:line="360" w:lineRule="auto"/>
         <w:jc w:val="both"/>
         <w:rPr>
-          <w:rFonts w:ascii="Arial" w:hAnsi="Arial" w:cs="Arial"/>
+          <w:rFonts w:ascii="Segoe UI Emoji" w:hAnsi="Segoe UI Emoji" w:cs="Segoe UI Emoji"/>
           <w:b/>
           <w:bCs/>
           <w:i/>
@@ -4363,7 +4127,11 @@
           <w:u w:val="single"/>
         </w:rPr>
       </w:pPr>
-      <w:r>
+    </w:p>
+    <w:p>
+      <w:pPr>
+        <w:spacing w:line="360" w:lineRule="auto"/>
+        <w:jc w:val="both"/>
         <w:rPr>
           <w:rFonts w:ascii="Arial" w:hAnsi="Arial" w:cs="Arial"/>
           <w:b/>
@@ -4372,6 +4140,16 @@
           <w:iCs/>
           <w:u w:val="single"/>
         </w:rPr>
+      </w:pPr>
+      <w:r>
+        <w:rPr>
+          <w:rFonts w:ascii="Arial" w:hAnsi="Arial" w:cs="Arial"/>
+          <w:b/>
+          <w:bCs/>
+          <w:i/>
+          <w:iCs/>
+          <w:u w:val="single"/>
+        </w:rPr>
         <w:t xml:space="preserve"> Segmento B2B (Business to Business)</w:t>
       </w:r>
     </w:p>
@@ -4387,7 +4165,6 @@
         <w:rPr>
           <w:rFonts w:ascii="Arial" w:hAnsi="Arial" w:cs="Arial"/>
         </w:rPr>
-        <w:lastRenderedPageBreak/>
         <w:t>Este segmento está formado por academias de preparación de oposiciones, que requieren herramientas de gestión y formación más completas.</w:t>
       </w:r>
     </w:p>
@@ -4538,6 +4315,7 @@
         <w:rPr>
           <w:rFonts w:ascii="Arial" w:hAnsi="Arial" w:cs="Arial"/>
         </w:rPr>
+        <w:lastRenderedPageBreak/>
         <w:t>Relación continua con el cliente.</w:t>
       </w:r>
     </w:p>
@@ -4741,7 +4519,6 @@
         <w:rPr>
           <w:rFonts w:ascii="Arial" w:hAnsi="Arial" w:cs="Arial"/>
         </w:rPr>
-        <w:lastRenderedPageBreak/>
         <w:t>CAC (Customer Acquisition Cost): coste de adquisición de nuevos usuarios, especialmente relevante en el segmento B2C.</w:t>
       </w:r>
     </w:p>
@@ -4817,13 +4594,7 @@
         <w:rPr>
           <w:rFonts w:ascii="Arial" w:hAnsi="Arial" w:cs="Arial"/>
         </w:rPr>
-        <w:t>El equilibrio entre estos indicadores será clave para asegurar la sostenibilidad económica del proyect</w:t>
-      </w:r>
-      <w:r>
-        <w:rPr>
-          <w:rFonts w:ascii="Arial" w:hAnsi="Arial" w:cs="Arial"/>
-        </w:rPr>
-        <w:t>o</w:t>
+        <w:t>El equilibrio entre estos indicadores será clave para asegurar la sostenibilidad económica del proyecto</w:t>
       </w:r>
       <w:r>
         <w:rPr>
@@ -4859,30 +4630,22 @@
           <w:bCs/>
           <w:color w:val="215E99" w:themeColor="text2" w:themeTint="BF"/>
         </w:rPr>
-        <w:t>P</w:t>
-      </w:r>
-      <w:r>
-        <w:rPr>
-          <w:rFonts w:ascii="Arial" w:hAnsi="Arial" w:cs="Arial"/>
-          <w:b/>
-          <w:bCs/>
-          <w:color w:val="215E99" w:themeColor="text2" w:themeTint="BF"/>
-        </w:rPr>
-        <w:t>osicionamiento en el mercado</w:t>
-      </w:r>
-    </w:p>
-    <w:p>
-      <w:pPr>
-        <w:spacing w:line="360" w:lineRule="auto"/>
-        <w:jc w:val="both"/>
-        <w:rPr>
-          <w:rFonts w:ascii="Arial" w:hAnsi="Arial" w:cs="Arial"/>
-        </w:rPr>
-      </w:pPr>
-      <w:r>
-        <w:rPr>
-          <w:rFonts w:ascii="Arial" w:hAnsi="Arial" w:cs="Arial"/>
-        </w:rPr>
+        <w:t>Posicionamiento en el mercado</w:t>
+      </w:r>
+    </w:p>
+    <w:p>
+      <w:pPr>
+        <w:spacing w:line="360" w:lineRule="auto"/>
+        <w:jc w:val="both"/>
+        <w:rPr>
+          <w:rFonts w:ascii="Arial" w:hAnsi="Arial" w:cs="Arial"/>
+        </w:rPr>
+      </w:pPr>
+      <w:r>
+        <w:rPr>
+          <w:rFonts w:ascii="Arial" w:hAnsi="Arial" w:cs="Arial"/>
+        </w:rPr>
+        <w:lastRenderedPageBreak/>
         <w:t>Actualmente, existen múltiples herramientas especializadas (test, memorización, organización), pero no una solución integral adaptada específicamente al mundo de las oposiciones.</w:t>
       </w:r>
     </w:p>
@@ -4999,15 +4762,6 @@
     </w:p>
     <w:p>
       <w:pPr>
-        <w:spacing w:line="360" w:lineRule="auto"/>
-        <w:jc w:val="both"/>
-        <w:rPr>
-          <w:rFonts w:ascii="Arial" w:hAnsi="Arial" w:cs="Arial"/>
-        </w:rPr>
-      </w:pPr>
-    </w:p>
-    <w:p>
-      <w:pPr>
         <w:pStyle w:val="Ttulo2"/>
       </w:pPr>
       <w:bookmarkStart w:id="6" w:name="_Toc226219487"/>
@@ -5070,7 +4824,7 @@
           <w:sz w:val="20"/>
           <w:szCs w:val="20"/>
         </w:rPr>
-        <w:t xml:space="preserve">, IA, bases de datos, explicadlos y poner por qué son relevantes, justificad por qué los usáis. En vuestro caso sería qué es el desarrollo web, front-end, back-end, IA, </w:t>
+        <w:t xml:space="preserve">, IA, bases de datos, explicadlos y poner por qué son relevantes, justificad por qué los usáis. En vuestro caso sería qué es el desarrollo web, </w:t>
       </w:r>
       <w:proofErr w:type="spellStart"/>
       <w:r>
@@ -5079,36 +4833,63 @@
           <w:sz w:val="20"/>
           <w:szCs w:val="20"/>
         </w:rPr>
-        <w:t>etc</w:t>
+        <w:t>front-end</w:t>
       </w:r>
       <w:proofErr w:type="spellEnd"/>
-    </w:p>
-    <w:p>
-      <w:pPr>
-        <w:spacing w:line="360" w:lineRule="auto"/>
-        <w:jc w:val="both"/>
+      <w:r>
         <w:rPr>
           <w:rFonts w:ascii="Arial" w:hAnsi="Arial" w:cs="Arial"/>
           <w:sz w:val="20"/>
           <w:szCs w:val="20"/>
         </w:rPr>
-      </w:pPr>
+        <w:t>, back-</w:t>
+      </w:r>
+      <w:proofErr w:type="spellStart"/>
       <w:r>
         <w:rPr>
           <w:rFonts w:ascii="Arial" w:hAnsi="Arial" w:cs="Arial"/>
           <w:sz w:val="20"/>
           <w:szCs w:val="20"/>
         </w:rPr>
-        <w:t xml:space="preserve"> Es donde demostráis que entendéis el tema a nivel técnico y académico. Podríais pensar que es tontería ya que si se desarrolla bien el trabajo se presupone que es porque entendéis el proyecto, pero pensad que igual uno de los que están en el tribunal no es profe de informática, </w:t>
-      </w:r>
+        <w:t>end</w:t>
+      </w:r>
+      <w:proofErr w:type="spellEnd"/>
       <w:r>
         <w:rPr>
           <w:rFonts w:ascii="Arial" w:hAnsi="Arial" w:cs="Arial"/>
           <w:sz w:val="20"/>
           <w:szCs w:val="20"/>
         </w:rPr>
-        <w:lastRenderedPageBreak/>
-        <w:t>si no de FOL/Empresa. Dicho profesor leerá el TFG y tendrá que entender qué hacéis y por qué lo hacéis.</w:t>
+        <w:t xml:space="preserve">, IA, </w:t>
+      </w:r>
+      <w:proofErr w:type="spellStart"/>
+      <w:r>
+        <w:rPr>
+          <w:rFonts w:ascii="Arial" w:hAnsi="Arial" w:cs="Arial"/>
+          <w:sz w:val="20"/>
+          <w:szCs w:val="20"/>
+        </w:rPr>
+        <w:t>etc</w:t>
+      </w:r>
+      <w:proofErr w:type="spellEnd"/>
+    </w:p>
+    <w:p>
+      <w:pPr>
+        <w:spacing w:line="360" w:lineRule="auto"/>
+        <w:jc w:val="both"/>
+        <w:rPr>
+          <w:rFonts w:ascii="Arial" w:hAnsi="Arial" w:cs="Arial"/>
+          <w:sz w:val="20"/>
+          <w:szCs w:val="20"/>
+        </w:rPr>
+      </w:pPr>
+      <w:r>
+        <w:rPr>
+          <w:rFonts w:ascii="Arial" w:hAnsi="Arial" w:cs="Arial"/>
+          <w:sz w:val="20"/>
+          <w:szCs w:val="20"/>
+        </w:rPr>
+        <w:t xml:space="preserve"> Es donde demostráis que entendéis el tema a nivel técnico y académico. Podríais pensar que es tontería ya que si se desarrolla bien el trabajo se presupone que es porque entendéis el proyecto, pero pensad que igual uno de los que están en el tribunal no es profe de informática, si no de FOL/Empresa. Dicho profesor leerá el TFG y tendrá que entender qué hacéis y por qué lo hacéis.</w:t>
       </w:r>
     </w:p>
     <w:p>
@@ -5190,7 +4971,22 @@
         <w:rPr>
           <w:rFonts w:ascii="Arial" w:hAnsi="Arial" w:cs="Arial"/>
         </w:rPr>
-        <w:t xml:space="preserve">Madurez y estabilidad: Spring Boot es un </w:t>
+        <w:lastRenderedPageBreak/>
+        <w:t xml:space="preserve">Madurez y estabilidad: Spring </w:t>
+      </w:r>
+      <w:proofErr w:type="spellStart"/>
+      <w:r>
+        <w:rPr>
+          <w:rFonts w:ascii="Arial" w:hAnsi="Arial" w:cs="Arial"/>
+        </w:rPr>
+        <w:t>Boot</w:t>
+      </w:r>
+      <w:proofErr w:type="spellEnd"/>
+      <w:r>
+        <w:rPr>
+          <w:rFonts w:ascii="Arial" w:hAnsi="Arial" w:cs="Arial"/>
+        </w:rPr>
+        <w:t xml:space="preserve"> es un </w:t>
       </w:r>
       <w:proofErr w:type="spellStart"/>
       <w:r>
@@ -5264,21 +5060,7 @@
         <w:rPr>
           <w:rFonts w:ascii="Arial" w:hAnsi="Arial" w:cs="Arial"/>
         </w:rPr>
-        <w:t xml:space="preserve">Integración con bases de datos: Compatible con múltiples sistemas de gestión de bases de datos (MySQL, PostgreSQL, etc.), esenciales para almacenar documentos, resultados </w:t>
-      </w:r>
-      <w:proofErr w:type="gramStart"/>
-      <w:r>
-        <w:rPr>
-          <w:rFonts w:ascii="Arial" w:hAnsi="Arial" w:cs="Arial"/>
-        </w:rPr>
-        <w:t>de test</w:t>
-      </w:r>
-      <w:proofErr w:type="gramEnd"/>
-      <w:r>
-        <w:rPr>
-          <w:rFonts w:ascii="Arial" w:hAnsi="Arial" w:cs="Arial"/>
-        </w:rPr>
-        <w:t xml:space="preserve"> y métricas de rendimiento.</w:t>
+        <w:t>Integración con bases de datos: Compatible con múltiples sistemas de gestión de bases de datos (MySQL, PostgreSQL, etc.), esenciales para almacenar documentos, resultados de test y métricas de rendimiento.</w:t>
       </w:r>
     </w:p>
     <w:p>
@@ -5343,27 +5125,7 @@
           <w:color w:val="215E99" w:themeColor="text2" w:themeTint="BF"/>
           <w:u w:val="single"/>
         </w:rPr>
-        <w:t>Front</w:t>
-      </w:r>
-      <w:r>
-        <w:rPr>
-          <w:rFonts w:ascii="Arial" w:hAnsi="Arial" w:cs="Arial"/>
-          <w:b/>
-          <w:bCs/>
-          <w:color w:val="215E99" w:themeColor="text2" w:themeTint="BF"/>
-          <w:u w:val="single"/>
-        </w:rPr>
-        <w:t>-</w:t>
-      </w:r>
-      <w:r>
-        <w:rPr>
-          <w:rFonts w:ascii="Arial" w:hAnsi="Arial" w:cs="Arial"/>
-          <w:b/>
-          <w:bCs/>
-          <w:color w:val="215E99" w:themeColor="text2" w:themeTint="BF"/>
-          <w:u w:val="single"/>
-        </w:rPr>
-        <w:t>end: HTML5, CSS3 y JavaScript</w:t>
+        <w:t>Front-end: HTML5, CSS3 y JavaScript</w:t>
       </w:r>
     </w:p>
     <w:p>
@@ -5452,7 +5214,6 @@
         <w:rPr>
           <w:rFonts w:ascii="Arial" w:hAnsi="Arial" w:cs="Arial"/>
         </w:rPr>
-        <w:lastRenderedPageBreak/>
         <w:t xml:space="preserve">Flexibilidad: Facilita futuras integraciones con </w:t>
       </w:r>
       <w:proofErr w:type="spellStart"/>
@@ -5481,21 +5242,7 @@
         <w:rPr>
           <w:rFonts w:ascii="Arial" w:hAnsi="Arial" w:cs="Arial"/>
         </w:rPr>
-        <w:t>, Vue) si se desea mejorar la experiencia visual o añadir SPA (</w:t>
-      </w:r>
-      <w:proofErr w:type="gramStart"/>
-      <w:r>
-        <w:rPr>
-          <w:rFonts w:ascii="Arial" w:hAnsi="Arial" w:cs="Arial"/>
-        </w:rPr>
-        <w:t>Single</w:t>
-      </w:r>
-      <w:proofErr w:type="gramEnd"/>
-      <w:r>
-        <w:rPr>
-          <w:rFonts w:ascii="Arial" w:hAnsi="Arial" w:cs="Arial"/>
-        </w:rPr>
-        <w:t xml:space="preserve"> Page </w:t>
+        <w:t xml:space="preserve">, Vue) si se desea mejorar la experiencia visual o añadir SPA (Single Page </w:t>
       </w:r>
       <w:proofErr w:type="spellStart"/>
       <w:r>
@@ -5568,17 +5315,7 @@
           <w:color w:val="215E99" w:themeColor="text2" w:themeTint="BF"/>
           <w:u w:val="single"/>
         </w:rPr>
-        <w:t>B</w:t>
-      </w:r>
-      <w:r>
-        <w:rPr>
-          <w:rFonts w:ascii="Arial" w:hAnsi="Arial" w:cs="Arial"/>
-          <w:b/>
-          <w:bCs/>
-          <w:color w:val="215E99" w:themeColor="text2" w:themeTint="BF"/>
-          <w:u w:val="single"/>
-        </w:rPr>
-        <w:t>ase de datos: MySQL / PostgreSQL</w:t>
+        <w:t>Base de datos: MySQL / PostgreSQL</w:t>
       </w:r>
     </w:p>
     <w:p>
@@ -5613,6 +5350,7 @@
         <w:rPr>
           <w:rFonts w:ascii="Arial" w:hAnsi="Arial" w:cs="Arial"/>
         </w:rPr>
+        <w:lastRenderedPageBreak/>
         <w:t>Almacenamiento estructurado: Ideal para guardar usuarios, grupos, exámenes, flashcards y métricas de rendimiento.</w:t>
       </w:r>
     </w:p>
@@ -5802,7 +5540,6 @@
           <w:color w:val="215E99" w:themeColor="text2" w:themeTint="BF"/>
           <w:u w:val="single"/>
         </w:rPr>
-        <w:lastRenderedPageBreak/>
         <w:t>Futuras integraciones: Inteligencia Artificial (IA)</w:t>
       </w:r>
     </w:p>
@@ -5893,6 +5630,7 @@
         <w:rPr>
           <w:rFonts w:ascii="Arial" w:hAnsi="Arial" w:cs="Arial"/>
         </w:rPr>
+        <w:lastRenderedPageBreak/>
         <w:t>Aunque la IA no será el núcleo inicial del proyecto, su inclusión futura puede aumentar el valor diferencial frente a otras aplicaciones y permitir un aprendizaje más personalizado.</w:t>
       </w:r>
     </w:p>
@@ -6125,7 +5863,21 @@
         <w:rPr>
           <w:rFonts w:ascii="Arial" w:hAnsi="Arial" w:cs="Arial"/>
         </w:rPr>
-        <w:t>, test, flashcards, documentos y gráficos interactivos.</w:t>
+        <w:t xml:space="preserve">, test, </w:t>
+      </w:r>
+      <w:proofErr w:type="spellStart"/>
+      <w:r>
+        <w:rPr>
+          <w:rFonts w:ascii="Arial" w:hAnsi="Arial" w:cs="Arial"/>
+        </w:rPr>
+        <w:t>flashcards</w:t>
+      </w:r>
+      <w:proofErr w:type="spellEnd"/>
+      <w:r>
+        <w:rPr>
+          <w:rFonts w:ascii="Arial" w:hAnsi="Arial" w:cs="Arial"/>
+        </w:rPr>
+        <w:t>, documentos y gráficos interactivos.</w:t>
       </w:r>
     </w:p>
     <w:p>
@@ -6386,21 +6138,7 @@
         <w:rPr>
           <w:rFonts w:ascii="Arial" w:hAnsi="Arial" w:cs="Arial"/>
         </w:rPr>
-        <w:t xml:space="preserve">Generación automática </w:t>
-      </w:r>
-      <w:proofErr w:type="gramStart"/>
-      <w:r>
-        <w:rPr>
-          <w:rFonts w:ascii="Arial" w:hAnsi="Arial" w:cs="Arial"/>
-        </w:rPr>
-        <w:t>de test</w:t>
-      </w:r>
-      <w:proofErr w:type="gramEnd"/>
-      <w:r>
-        <w:rPr>
-          <w:rFonts w:ascii="Arial" w:hAnsi="Arial" w:cs="Arial"/>
-        </w:rPr>
-        <w:t>, flashcards y resúmenes.</w:t>
+        <w:t>Generación automática de test, flashcards y resúmenes.</w:t>
       </w:r>
     </w:p>
     <w:p>
@@ -6572,19 +6310,7 @@
         <w:rPr>
           <w:rFonts w:ascii="Arial" w:hAnsi="Arial" w:cs="Arial"/>
         </w:rPr>
-        <w:t xml:space="preserve">Diseñar y desarrollar una plataforma web que centralice y ofrezca recursos de </w:t>
-      </w:r>
-      <w:r>
-        <w:rPr>
-          <w:rFonts w:ascii="Arial" w:hAnsi="Arial" w:cs="Arial"/>
-        </w:rPr>
-        <w:t>estudio propios</w:t>
-      </w:r>
-      <w:r>
-        <w:rPr>
-          <w:rFonts w:ascii="Arial" w:hAnsi="Arial" w:cs="Arial"/>
-        </w:rPr>
-        <w:t xml:space="preserve"> y de calidad (apuntes, flashcards, evaluaciones, vídeos…), orientado a la preparación de oposiciones de estos cuerpos de seguridad y emergencias. </w:t>
+        <w:t xml:space="preserve">Diseñar y desarrollar una plataforma web que centralice y ofrezca recursos de estudio propios y de calidad (apuntes, flashcards, evaluaciones, vídeos…), orientado a la preparación de oposiciones de estos cuerpos de seguridad y emergencias. </w:t>
       </w:r>
     </w:p>
     <w:p>
@@ -6626,19 +6352,7 @@
         <w:rPr>
           <w:rFonts w:ascii="Arial" w:hAnsi="Arial" w:cs="Arial"/>
         </w:rPr>
-        <w:t xml:space="preserve">Analizar las necesidades de estudio de los opositores a cuerpos de seguridad </w:t>
-      </w:r>
-      <w:r>
-        <w:rPr>
-          <w:rFonts w:ascii="Arial" w:hAnsi="Arial" w:cs="Arial"/>
-        </w:rPr>
-        <w:t>y emergencias</w:t>
-      </w:r>
-      <w:r>
-        <w:rPr>
-          <w:rFonts w:ascii="Arial" w:hAnsi="Arial" w:cs="Arial"/>
-        </w:rPr>
-        <w:t xml:space="preserve">, así como las carencias detectadas en las plataformas de preparación existentes. </w:t>
+        <w:t xml:space="preserve">Analizar las necesidades de estudio de los opositores a cuerpos de seguridad y emergencias, así como las carencias detectadas en las plataformas de preparación existentes. </w:t>
       </w:r>
     </w:p>
     <w:p>
@@ -6752,19 +6466,7 @@
         <w:rPr>
           <w:rFonts w:ascii="Arial" w:hAnsi="Arial" w:cs="Arial"/>
         </w:rPr>
-        <w:t xml:space="preserve">Crear un sistema de evaluaciones y test con corrección automática que permita al </w:t>
-      </w:r>
-      <w:r>
-        <w:rPr>
-          <w:rFonts w:ascii="Arial" w:hAnsi="Arial" w:cs="Arial"/>
-        </w:rPr>
-        <w:t>o</w:t>
-      </w:r>
-      <w:r>
-        <w:rPr>
-          <w:rFonts w:ascii="Arial" w:hAnsi="Arial" w:cs="Arial"/>
-        </w:rPr>
-        <w:t xml:space="preserve">positor medir su nivel de preparación de forma objetiva. </w:t>
+        <w:t xml:space="preserve">Crear un sistema de evaluaciones y test con corrección automática que permita al opositor medir su nivel de preparación de forma objetiva. </w:t>
       </w:r>
     </w:p>
     <w:p>
@@ -6908,53 +6610,198 @@
         <w:rPr>
           <w:rFonts w:ascii="Arial" w:hAnsi="Arial" w:cs="Arial"/>
         </w:rPr>
-        <w:t> Tipo de proyecto (práctico, teórico, experimental...).</w:t>
-      </w:r>
-    </w:p>
-    <w:p>
-      <w:pPr>
-        <w:rPr>
-          <w:rFonts w:ascii="Arial" w:hAnsi="Arial" w:cs="Arial"/>
-        </w:rPr>
-      </w:pPr>
-      <w:r>
-        <w:rPr>
-          <w:rFonts w:ascii="Arial" w:hAnsi="Arial" w:cs="Arial"/>
-        </w:rPr>
-        <w:t> Fases de trabajo (recogida de datos, diseño de la aplicación, testeo...).</w:t>
-      </w:r>
-    </w:p>
-    <w:p>
-      <w:pPr>
-        <w:rPr>
-          <w:rFonts w:ascii="Arial" w:hAnsi="Arial" w:cs="Arial"/>
-        </w:rPr>
-      </w:pPr>
-      <w:r>
-        <w:rPr>
-          <w:rFonts w:ascii="Arial" w:hAnsi="Arial" w:cs="Arial"/>
-        </w:rPr>
-        <w:t> Materiales y herramientas utilizadas.</w:t>
-      </w:r>
-    </w:p>
-    <w:p>
-      <w:pPr>
-        <w:rPr>
-          <w:rFonts w:ascii="Arial" w:hAnsi="Arial" w:cs="Arial"/>
-        </w:rPr>
-      </w:pPr>
-    </w:p>
-    <w:p>
-      <w:pPr>
-        <w:rPr>
-          <w:rFonts w:ascii="Arial" w:hAnsi="Arial" w:cs="Arial"/>
-        </w:rPr>
-      </w:pPr>
-      <w:r>
-        <w:rPr>
-          <w:rFonts w:ascii="Arial" w:hAnsi="Arial" w:cs="Arial"/>
-        </w:rPr>
-        <w:t> Organización del tiempo.</w:t>
+        <w:t xml:space="preserve"> </w:t>
+      </w:r>
+    </w:p>
+    <w:p>
+      <w:pPr>
+        <w:pStyle w:val="Prrafodelista"/>
+        <w:numPr>
+          <w:ilvl w:val="0"/>
+          <w:numId w:val="35"/>
+        </w:numPr>
+        <w:rPr>
+          <w:rFonts w:ascii="Arial" w:hAnsi="Arial" w:cs="Arial"/>
+          <w:b/>
+        </w:rPr>
+      </w:pPr>
+      <w:r>
+        <w:rPr>
+          <w:rFonts w:ascii="Arial" w:hAnsi="Arial" w:cs="Arial"/>
+          <w:b/>
+        </w:rPr>
+        <w:t>Tipo de proyecto (práctico, teórico, experimental...).</w:t>
+      </w:r>
+    </w:p>
+    <w:p>
+      <w:pPr>
+        <w:spacing w:line="360" w:lineRule="auto"/>
+        <w:jc w:val="both"/>
+        <w:rPr>
+          <w:rFonts w:ascii="Arial" w:hAnsi="Arial" w:cs="Arial"/>
+        </w:rPr>
+      </w:pPr>
+      <w:r>
+        <w:rPr>
+          <w:rFonts w:ascii="Arial" w:hAnsi="Arial" w:cs="Arial"/>
+        </w:rPr>
+        <w:t>El presente proyecto consiste en el desarrollo de una plataforma web educativa orientada a la preparación de oposiciones, especialmente dirigida a aspirantes de bomberos y Guardia Civil</w:t>
+      </w:r>
+      <w:r>
+        <w:rPr>
+          <w:rFonts w:ascii="Arial" w:hAnsi="Arial" w:cs="Arial"/>
+        </w:rPr>
+        <w:t xml:space="preserve"> en su versión alfa</w:t>
+      </w:r>
+      <w:r>
+        <w:rPr>
+          <w:rFonts w:ascii="Arial" w:hAnsi="Arial" w:cs="Arial"/>
+        </w:rPr>
+        <w:t>, con previsión de ampliación a otr</w:t>
+      </w:r>
+      <w:r>
+        <w:rPr>
+          <w:rFonts w:ascii="Arial" w:hAnsi="Arial" w:cs="Arial"/>
+        </w:rPr>
+        <w:t>a</w:t>
+      </w:r>
+      <w:r>
+        <w:rPr>
+          <w:rFonts w:ascii="Arial" w:hAnsi="Arial" w:cs="Arial"/>
+        </w:rPr>
+        <w:t xml:space="preserve">s </w:t>
+      </w:r>
+      <w:r>
+        <w:rPr>
+          <w:rFonts w:ascii="Arial" w:hAnsi="Arial" w:cs="Arial"/>
+        </w:rPr>
+        <w:t xml:space="preserve">oposiciones </w:t>
+      </w:r>
+      <w:r>
+        <w:rPr>
+          <w:rFonts w:ascii="Arial" w:hAnsi="Arial" w:cs="Arial"/>
+        </w:rPr>
+        <w:t>en el futuro. Se trata de un proyecto de carácter teórico-práctico que integra tanto la elaboración de contenidos como el diseño de herramientas digitales enfocadas a mejorar el proceso de aprendizaje.</w:t>
+      </w:r>
+    </w:p>
+    <w:p>
+      <w:pPr>
+        <w:spacing w:line="360" w:lineRule="auto"/>
+        <w:jc w:val="both"/>
+        <w:rPr>
+          <w:rFonts w:ascii="Arial" w:hAnsi="Arial" w:cs="Arial"/>
+        </w:rPr>
+      </w:pPr>
+      <w:r>
+        <w:rPr>
+          <w:rFonts w:ascii="Arial" w:hAnsi="Arial" w:cs="Arial"/>
+        </w:rPr>
+        <w:t>La plataforma combina distintos recursos formativos, incluyendo contenido teórico en forma de apuntes y resúmenes, material audiovisual mediante vídeos explicativos, y herramientas prácticas como test de evaluación y sistemas de seguimiento del progreso a través de gráficos de evolución. De este modo, se busca ofrecer una experiencia de aprendizaje completa que facilite tanto la adquisición de conocimientos como la autoevaluación continua del usuario.</w:t>
+      </w:r>
+    </w:p>
+    <w:p>
+      <w:pPr>
+        <w:spacing w:line="360" w:lineRule="auto"/>
+        <w:jc w:val="both"/>
+        <w:rPr>
+          <w:rFonts w:ascii="Arial" w:hAnsi="Arial" w:cs="Arial"/>
+        </w:rPr>
+      </w:pPr>
+      <w:r>
+        <w:rPr>
+          <w:rFonts w:ascii="Arial" w:hAnsi="Arial" w:cs="Arial"/>
+        </w:rPr>
+        <w:t xml:space="preserve">Asimismo, el proyecto incorpora un modelo de negocio de tipo </w:t>
+      </w:r>
+      <w:proofErr w:type="spellStart"/>
+      <w:r>
+        <w:rPr>
+          <w:rFonts w:ascii="Arial" w:hAnsi="Arial" w:cs="Arial"/>
+        </w:rPr>
+        <w:t>freemium</w:t>
+      </w:r>
+      <w:proofErr w:type="spellEnd"/>
+      <w:r>
+        <w:rPr>
+          <w:rFonts w:ascii="Arial" w:hAnsi="Arial" w:cs="Arial"/>
+        </w:rPr>
+        <w:t>, en el que se ofrece una parte del contenido de manera gratuita, complementada con funcionalidades y recursos premium accesibles mediante suscripción. Además, contiene una sección específica destinada a academias, permitiendo su integración en la plataforma como apoyo a la formación de sus alumnos.</w:t>
+      </w:r>
+    </w:p>
+    <w:p>
+      <w:pPr>
+        <w:spacing w:line="360" w:lineRule="auto"/>
+        <w:jc w:val="both"/>
+        <w:rPr>
+          <w:rFonts w:ascii="Arial" w:hAnsi="Arial" w:cs="Arial"/>
+        </w:rPr>
+      </w:pPr>
+      <w:r>
+        <w:rPr>
+          <w:rFonts w:ascii="Arial" w:hAnsi="Arial" w:cs="Arial"/>
+        </w:rPr>
+        <w:t>El conjunto, se trata de una solución tecnológica dentro del ámbito de la educación digital, cuyo objetivo principal es optimizar la preparación de oposiciones mediante el uso de herramientas interactivas y contenido estructurado.</w:t>
+      </w:r>
+    </w:p>
+    <w:p>
+      <w:pPr>
+        <w:rPr>
+          <w:rFonts w:ascii="Arial" w:hAnsi="Arial" w:cs="Arial"/>
+        </w:rPr>
+      </w:pPr>
+    </w:p>
+    <w:p>
+      <w:pPr>
+        <w:pStyle w:val="Prrafodelista"/>
+        <w:numPr>
+          <w:ilvl w:val="0"/>
+          <w:numId w:val="35"/>
+        </w:numPr>
+        <w:rPr>
+          <w:rFonts w:ascii="Arial" w:hAnsi="Arial" w:cs="Arial"/>
+        </w:rPr>
+      </w:pPr>
+      <w:r>
+        <w:rPr>
+          <w:rFonts w:ascii="Arial" w:hAnsi="Arial" w:cs="Arial"/>
+        </w:rPr>
+        <w:t>Fases de trabajo (recogida de datos, diseño de la aplicación, testeo...).</w:t>
+      </w:r>
+    </w:p>
+    <w:p>
+      <w:pPr>
+        <w:pStyle w:val="Prrafodelista"/>
+        <w:numPr>
+          <w:ilvl w:val="0"/>
+          <w:numId w:val="35"/>
+        </w:numPr>
+        <w:rPr>
+          <w:rFonts w:ascii="Arial" w:hAnsi="Arial" w:cs="Arial"/>
+        </w:rPr>
+      </w:pPr>
+      <w:r>
+        <w:rPr>
+          <w:rFonts w:ascii="Arial" w:hAnsi="Arial" w:cs="Arial"/>
+        </w:rPr>
+        <w:t>Materiales y herramientas utilizadas.</w:t>
+      </w:r>
+    </w:p>
+    <w:p>
+      <w:pPr>
+        <w:pStyle w:val="Prrafodelista"/>
+        <w:numPr>
+          <w:ilvl w:val="0"/>
+          <w:numId w:val="35"/>
+        </w:numPr>
+        <w:rPr>
+          <w:rFonts w:ascii="Arial" w:hAnsi="Arial" w:cs="Arial"/>
+        </w:rPr>
+      </w:pPr>
+      <w:r>
+        <w:rPr>
+          <w:rFonts w:ascii="Arial" w:hAnsi="Arial" w:cs="Arial"/>
+        </w:rPr>
+        <w:t>Organización del tiempo.</w:t>
       </w:r>
     </w:p>
     <w:p>
@@ -7016,15 +6863,20 @@
     </w:p>
     <w:p>
       <w:pPr>
-        <w:rPr>
-          <w:rFonts w:ascii="Arial" w:hAnsi="Arial" w:cs="Arial"/>
-        </w:rPr>
-      </w:pPr>
-      <w:r>
-        <w:rPr>
-          <w:rFonts w:ascii="Arial" w:hAnsi="Arial" w:cs="Arial"/>
-        </w:rPr>
-        <w:t> Lo que se ha logrado hasta ahora (aunque no hayáis podido finalizar a la</w:t>
+        <w:pStyle w:val="Prrafodelista"/>
+        <w:numPr>
+          <w:ilvl w:val="0"/>
+          <w:numId w:val="35"/>
+        </w:numPr>
+        <w:rPr>
+          <w:rFonts w:ascii="Arial" w:hAnsi="Arial" w:cs="Arial"/>
+        </w:rPr>
+      </w:pPr>
+      <w:r>
+        <w:rPr>
+          <w:rFonts w:ascii="Arial" w:hAnsi="Arial" w:cs="Arial"/>
+        </w:rPr>
+        <w:t>Lo que se ha logrado hasta ahora (aunque no hayáis podido finalizar a la</w:t>
       </w:r>
     </w:p>
     <w:p>
@@ -7042,28 +6894,38 @@
     </w:p>
     <w:p>
       <w:pPr>
-        <w:rPr>
-          <w:rFonts w:ascii="Arial" w:hAnsi="Arial" w:cs="Arial"/>
-        </w:rPr>
-      </w:pPr>
-      <w:r>
-        <w:rPr>
-          <w:rFonts w:ascii="Arial" w:hAnsi="Arial" w:cs="Arial"/>
-        </w:rPr>
-        <w:t> Pruebas y ajustes.</w:t>
-      </w:r>
-    </w:p>
-    <w:p>
-      <w:pPr>
-        <w:rPr>
-          <w:rFonts w:ascii="Arial" w:hAnsi="Arial" w:cs="Arial"/>
-        </w:rPr>
-      </w:pPr>
-      <w:r>
-        <w:rPr>
-          <w:rFonts w:ascii="Arial" w:hAnsi="Arial" w:cs="Arial"/>
-        </w:rPr>
-        <w:t> Documentación visual.</w:t>
+        <w:pStyle w:val="Prrafodelista"/>
+        <w:numPr>
+          <w:ilvl w:val="0"/>
+          <w:numId w:val="35"/>
+        </w:numPr>
+        <w:rPr>
+          <w:rFonts w:ascii="Arial" w:hAnsi="Arial" w:cs="Arial"/>
+        </w:rPr>
+      </w:pPr>
+      <w:r>
+        <w:rPr>
+          <w:rFonts w:ascii="Arial" w:hAnsi="Arial" w:cs="Arial"/>
+        </w:rPr>
+        <w:t>Pruebas y ajustes.</w:t>
+      </w:r>
+    </w:p>
+    <w:p>
+      <w:pPr>
+        <w:pStyle w:val="Prrafodelista"/>
+        <w:numPr>
+          <w:ilvl w:val="0"/>
+          <w:numId w:val="35"/>
+        </w:numPr>
+        <w:rPr>
+          <w:rFonts w:ascii="Arial" w:hAnsi="Arial" w:cs="Arial"/>
+        </w:rPr>
+      </w:pPr>
+      <w:r>
+        <w:rPr>
+          <w:rFonts w:ascii="Arial" w:hAnsi="Arial" w:cs="Arial"/>
+        </w:rPr>
+        <w:t>Documentación visual.</w:t>
       </w:r>
     </w:p>
     <w:p>
@@ -7111,41 +6973,56 @@
     </w:p>
     <w:p>
       <w:pPr>
-        <w:rPr>
-          <w:rFonts w:ascii="Arial" w:hAnsi="Arial" w:cs="Arial"/>
-        </w:rPr>
-      </w:pPr>
-      <w:r>
-        <w:rPr>
-          <w:rFonts w:ascii="Arial" w:hAnsi="Arial" w:cs="Arial"/>
-        </w:rPr>
-        <w:t> ¿Se lograron los objetivos?</w:t>
-      </w:r>
-    </w:p>
-    <w:p>
-      <w:pPr>
-        <w:rPr>
-          <w:rFonts w:ascii="Arial" w:hAnsi="Arial" w:cs="Arial"/>
-        </w:rPr>
-      </w:pPr>
-      <w:r>
-        <w:rPr>
-          <w:rFonts w:ascii="Arial" w:hAnsi="Arial" w:cs="Arial"/>
-        </w:rPr>
-        <w:t> Comparación entre lo esperado y lo conseguido.</w:t>
-      </w:r>
-    </w:p>
-    <w:p>
-      <w:pPr>
-        <w:rPr>
-          <w:rFonts w:ascii="Arial" w:hAnsi="Arial" w:cs="Arial"/>
-        </w:rPr>
-      </w:pPr>
-      <w:r>
-        <w:rPr>
-          <w:rFonts w:ascii="Arial" w:hAnsi="Arial" w:cs="Arial"/>
-        </w:rPr>
-        <w:t> Escalabilidad y portabilidad (si aplicase).</w:t>
+        <w:pStyle w:val="Prrafodelista"/>
+        <w:numPr>
+          <w:ilvl w:val="0"/>
+          <w:numId w:val="35"/>
+        </w:numPr>
+        <w:rPr>
+          <w:rFonts w:ascii="Arial" w:hAnsi="Arial" w:cs="Arial"/>
+        </w:rPr>
+      </w:pPr>
+      <w:r>
+        <w:rPr>
+          <w:rFonts w:ascii="Arial" w:hAnsi="Arial" w:cs="Arial"/>
+        </w:rPr>
+        <w:t>¿Se lograron los objetivos?</w:t>
+      </w:r>
+    </w:p>
+    <w:p>
+      <w:pPr>
+        <w:pStyle w:val="Prrafodelista"/>
+        <w:numPr>
+          <w:ilvl w:val="0"/>
+          <w:numId w:val="35"/>
+        </w:numPr>
+        <w:rPr>
+          <w:rFonts w:ascii="Arial" w:hAnsi="Arial" w:cs="Arial"/>
+        </w:rPr>
+      </w:pPr>
+      <w:r>
+        <w:rPr>
+          <w:rFonts w:ascii="Arial" w:hAnsi="Arial" w:cs="Arial"/>
+        </w:rPr>
+        <w:t>Comparación entre lo esperado y lo conseguido.</w:t>
+      </w:r>
+    </w:p>
+    <w:p>
+      <w:pPr>
+        <w:pStyle w:val="Prrafodelista"/>
+        <w:numPr>
+          <w:ilvl w:val="0"/>
+          <w:numId w:val="35"/>
+        </w:numPr>
+        <w:rPr>
+          <w:rFonts w:ascii="Arial" w:hAnsi="Arial" w:cs="Arial"/>
+        </w:rPr>
+      </w:pPr>
+      <w:r>
+        <w:rPr>
+          <w:rFonts w:ascii="Arial" w:hAnsi="Arial" w:cs="Arial"/>
+        </w:rPr>
+        <w:t>Escalabilidad y portabilidad (si aplicase).</w:t>
       </w:r>
     </w:p>
     <w:p>
@@ -7174,7 +7051,6 @@
       </w:pPr>
       <w:bookmarkStart w:id="13" w:name="_Toc226219494"/>
       <w:r>
-        <w:lastRenderedPageBreak/>
         <w:t>CONCLUSIÓN</w:t>
       </w:r>
       <w:bookmarkEnd w:id="13"/>
@@ -7194,41 +7070,58 @@
     </w:p>
     <w:p>
       <w:pPr>
-        <w:rPr>
-          <w:rFonts w:ascii="Arial" w:hAnsi="Arial" w:cs="Arial"/>
-        </w:rPr>
-      </w:pPr>
-      <w:r>
-        <w:rPr>
-          <w:rFonts w:ascii="Arial" w:hAnsi="Arial" w:cs="Arial"/>
-        </w:rPr>
-        <w:t> Valoración final del proyecto.</w:t>
-      </w:r>
-    </w:p>
-    <w:p>
-      <w:pPr>
-        <w:rPr>
-          <w:rFonts w:ascii="Arial" w:hAnsi="Arial" w:cs="Arial"/>
-        </w:rPr>
-      </w:pPr>
-      <w:r>
-        <w:rPr>
-          <w:rFonts w:ascii="Arial" w:hAnsi="Arial" w:cs="Arial"/>
-        </w:rPr>
-        <w:t> Aprendizajes adquiridos.</w:t>
-      </w:r>
-    </w:p>
-    <w:p>
-      <w:pPr>
-        <w:rPr>
-          <w:rFonts w:ascii="Arial" w:hAnsi="Arial" w:cs="Arial"/>
-        </w:rPr>
-      </w:pPr>
-      <w:r>
-        <w:rPr>
-          <w:rFonts w:ascii="Arial" w:hAnsi="Arial" w:cs="Arial"/>
-        </w:rPr>
-        <w:t> Posibles mejoras futuras.</w:t>
+        <w:pStyle w:val="Prrafodelista"/>
+        <w:numPr>
+          <w:ilvl w:val="0"/>
+          <w:numId w:val="35"/>
+        </w:numPr>
+        <w:rPr>
+          <w:rFonts w:ascii="Arial" w:hAnsi="Arial" w:cs="Arial"/>
+        </w:rPr>
+      </w:pPr>
+      <w:r>
+        <w:rPr>
+          <w:rFonts w:ascii="Arial" w:hAnsi="Arial" w:cs="Arial"/>
+        </w:rPr>
+        <w:t>Valoración final del proyecto.</w:t>
+      </w:r>
+    </w:p>
+    <w:p>
+      <w:pPr>
+        <w:pStyle w:val="Prrafodelista"/>
+        <w:numPr>
+          <w:ilvl w:val="0"/>
+          <w:numId w:val="35"/>
+        </w:numPr>
+        <w:rPr>
+          <w:rFonts w:ascii="Arial" w:hAnsi="Arial" w:cs="Arial"/>
+        </w:rPr>
+      </w:pPr>
+      <w:r>
+        <w:rPr>
+          <w:rFonts w:ascii="Arial" w:hAnsi="Arial" w:cs="Arial"/>
+        </w:rPr>
+        <w:t>Aprendizajes adquiridos.</w:t>
+      </w:r>
+    </w:p>
+    <w:p>
+      <w:pPr>
+        <w:pStyle w:val="Prrafodelista"/>
+        <w:numPr>
+          <w:ilvl w:val="0"/>
+          <w:numId w:val="35"/>
+        </w:numPr>
+        <w:rPr>
+          <w:rFonts w:ascii="Arial" w:hAnsi="Arial" w:cs="Arial"/>
+        </w:rPr>
+      </w:pPr>
+      <w:bookmarkStart w:id="14" w:name="_GoBack"/>
+      <w:bookmarkEnd w:id="14"/>
+      <w:r>
+        <w:rPr>
+          <w:rFonts w:ascii="Arial" w:hAnsi="Arial" w:cs="Arial"/>
+        </w:rPr>
+        <w:t>Posibles mejoras futuras.</w:t>
       </w:r>
     </w:p>
     <w:p>
@@ -7249,11 +7142,11 @@
       <w:pPr>
         <w:pStyle w:val="Ttulo1"/>
       </w:pPr>
-      <w:bookmarkStart w:id="14" w:name="_Toc226219495"/>
+      <w:bookmarkStart w:id="15" w:name="_Toc226219495"/>
       <w:r>
         <w:t>REFERENCIAS BIBLIOGRÁFICAS</w:t>
       </w:r>
-      <w:bookmarkEnd w:id="14"/>
+      <w:bookmarkEnd w:id="15"/>
     </w:p>
     <w:p>
       <w:pPr>
@@ -7299,11 +7192,11 @@
       <w:pPr>
         <w:pStyle w:val="Ttulo1"/>
       </w:pPr>
-      <w:bookmarkStart w:id="15" w:name="_Toc226219496"/>
+      <w:bookmarkStart w:id="16" w:name="_Toc226219496"/>
       <w:r>
         <w:t>ANEXOS</w:t>
       </w:r>
-      <w:bookmarkEnd w:id="15"/>
+      <w:bookmarkEnd w:id="16"/>
     </w:p>
     <w:p>
       <w:pPr>
@@ -7332,7 +7225,7 @@
 </file>
 
 <file path=word/endnotes.xml><?xml version="1.0" encoding="utf-8"?>
-<w:endnotes xmlns:wpc="http://schemas.microsoft.com/office/word/2010/wordprocessingCanvas" xmlns:cx="http://schemas.microsoft.com/office/drawing/2014/chartex" xmlns:cx1="http://schemas.microsoft.com/office/drawing/2015/9/8/chartex" xmlns:cx2="http://schemas.microsoft.com/office/drawing/2015/10/21/chartex" xmlns:cx3="http://schemas.microsoft.com/office/drawing/2016/5/9/chartex" xmlns:cx4="http://schemas.microsoft.com/office/drawing/2016/5/10/chartex" xmlns:cx5="http://schemas.microsoft.com/office/drawing/2016/5/11/chartex" xmlns:cx6="http://schemas.microsoft.com/office/drawing/2016/5/12/chartex" xmlns:cx7="http://schemas.microsoft.com/office/drawing/2016/5/13/chartex" xmlns:cx8="http://schemas.microsoft.com/office/drawing/2016/5/14/chartex" xmlns:mc="http://schemas.openxmlformats.org/markup-compatibility/2006" xmlns:aink="http://schemas.microsoft.com/office/drawing/2016/ink" xmlns:am3d="http://schemas.microsoft.com/office/drawing/2017/model3d" xmlns:o="urn:schemas-microsoft-com:office:office" xmlns:oel="http://schemas.microsoft.com/office/2019/extlst" xmlns:r="http://schemas.openxmlformats.org/officeDocument/2006/relationships" xmlns:m="http://schemas.openxmlformats.org/officeDocument/2006/math" xmlns:v="urn:schemas-microsoft-com:vml" xmlns:wp14="http://schemas.microsoft.com/office/word/2010/wordprocessingDrawing" xmlns:wp="http://schemas.openxmlformats.org/drawingml/2006/wordprocessingDrawing" xmlns:w10="urn:schemas-microsoft-com:office:word" xmlns:w="http://schemas.openxmlformats.org/wordprocessingml/2006/main" xmlns:w14="http://schemas.microsoft.com/office/word/2010/wordml" xmlns:w15="http://schemas.microsoft.com/office/word/2012/wordml" xmlns:w16cex="http://schemas.microsoft.com/office/word/2018/wordml/cex" xmlns:w16cid="http://schemas.microsoft.com/office/word/2016/wordml/cid" xmlns:w16="http://schemas.microsoft.com/office/word/2018/wordml" xmlns:w16du="http://schemas.microsoft.com/office/word/2023/wordml/word16du" xmlns:w16sdtdh="http://schemas.microsoft.com/office/word/2020/wordml/sdtdatahash" xmlns:w16sdtfl="http://schemas.microsoft.com/office/word/2024/wordml/sdtformatlock" xmlns:w16se="http://schemas.microsoft.com/office/word/2015/wordml/symex" xmlns:wpg="http://schemas.microsoft.com/office/word/2010/wordprocessingGroup" xmlns:wpi="http://schemas.microsoft.com/office/word/2010/wordprocessingInk" xmlns:wne="http://schemas.microsoft.com/office/word/2006/wordml" xmlns:wps="http://schemas.microsoft.com/office/word/2010/wordprocessingShape" mc:Ignorable="w14 w15 w16se w16cid w16 w16cex w16sdtdh w16sdtfl w16du wp14">
+<w:endnotes xmlns:wpc="http://schemas.microsoft.com/office/word/2010/wordprocessingCanvas" xmlns:cx="http://schemas.microsoft.com/office/drawing/2014/chartex" xmlns:cx1="http://schemas.microsoft.com/office/drawing/2015/9/8/chartex" xmlns:cx2="http://schemas.microsoft.com/office/drawing/2015/10/21/chartex" xmlns:cx3="http://schemas.microsoft.com/office/drawing/2016/5/9/chartex" xmlns:cx4="http://schemas.microsoft.com/office/drawing/2016/5/10/chartex" xmlns:cx5="http://schemas.microsoft.com/office/drawing/2016/5/11/chartex" xmlns:cx6="http://schemas.microsoft.com/office/drawing/2016/5/12/chartex" xmlns:cx7="http://schemas.microsoft.com/office/drawing/2016/5/13/chartex" xmlns:cx8="http://schemas.microsoft.com/office/drawing/2016/5/14/chartex" xmlns:mc="http://schemas.openxmlformats.org/markup-compatibility/2006" xmlns:aink="http://schemas.microsoft.com/office/drawing/2016/ink" xmlns:am3d="http://schemas.microsoft.com/office/drawing/2017/model3d" xmlns:o="urn:schemas-microsoft-com:office:office" xmlns:r="http://schemas.openxmlformats.org/officeDocument/2006/relationships" xmlns:m="http://schemas.openxmlformats.org/officeDocument/2006/math" xmlns:v="urn:schemas-microsoft-com:vml" xmlns:wp14="http://schemas.microsoft.com/office/word/2010/wordprocessingDrawing" xmlns:wp="http://schemas.openxmlformats.org/drawingml/2006/wordprocessingDrawing" xmlns:w10="urn:schemas-microsoft-com:office:word" xmlns:w="http://schemas.openxmlformats.org/wordprocessingml/2006/main" xmlns:w14="http://schemas.microsoft.com/office/word/2010/wordml" xmlns:w15="http://schemas.microsoft.com/office/word/2012/wordml" xmlns:w16cid="http://schemas.microsoft.com/office/word/2016/wordml/cid" xmlns:w16se="http://schemas.microsoft.com/office/word/2015/wordml/symex" xmlns:wpg="http://schemas.microsoft.com/office/word/2010/wordprocessingGroup" xmlns:wpi="http://schemas.microsoft.com/office/word/2010/wordprocessingInk" xmlns:wne="http://schemas.microsoft.com/office/word/2006/wordml" xmlns:wps="http://schemas.microsoft.com/office/word/2010/wordprocessingShape" mc:Ignorable="w14 w15 w16se w16cid wp14">
   <w:endnote w:type="separator" w:id="-1">
     <w:p>
       <w:pPr>
@@ -7357,7 +7250,7 @@
 </file>
 
 <file path=word/footer1.xml><?xml version="1.0" encoding="utf-8"?>
-<w:ftr xmlns:wpc="http://schemas.microsoft.com/office/word/2010/wordprocessingCanvas" xmlns:cx="http://schemas.microsoft.com/office/drawing/2014/chartex" xmlns:cx1="http://schemas.microsoft.com/office/drawing/2015/9/8/chartex" xmlns:cx2="http://schemas.microsoft.com/office/drawing/2015/10/21/chartex" xmlns:cx3="http://schemas.microsoft.com/office/drawing/2016/5/9/chartex" xmlns:cx4="http://schemas.microsoft.com/office/drawing/2016/5/10/chartex" xmlns:cx5="http://schemas.microsoft.com/office/drawing/2016/5/11/chartex" xmlns:cx6="http://schemas.microsoft.com/office/drawing/2016/5/12/chartex" xmlns:cx7="http://schemas.microsoft.com/office/drawing/2016/5/13/chartex" xmlns:cx8="http://schemas.microsoft.com/office/drawing/2016/5/14/chartex" xmlns:mc="http://schemas.openxmlformats.org/markup-compatibility/2006" xmlns:aink="http://schemas.microsoft.com/office/drawing/2016/ink" xmlns:am3d="http://schemas.microsoft.com/office/drawing/2017/model3d" xmlns:o="urn:schemas-microsoft-com:office:office" xmlns:oel="http://schemas.microsoft.com/office/2019/extlst" xmlns:r="http://schemas.openxmlformats.org/officeDocument/2006/relationships" xmlns:m="http://schemas.openxmlformats.org/officeDocument/2006/math" xmlns:v="urn:schemas-microsoft-com:vml" xmlns:wp14="http://schemas.microsoft.com/office/word/2010/wordprocessingDrawing" xmlns:wp="http://schemas.openxmlformats.org/drawingml/2006/wordprocessingDrawing" xmlns:w10="urn:schemas-microsoft-com:office:word" xmlns:w="http://schemas.openxmlformats.org/wordprocessingml/2006/main" xmlns:w14="http://schemas.microsoft.com/office/word/2010/wordml" xmlns:w15="http://schemas.microsoft.com/office/word/2012/wordml" xmlns:w16cex="http://schemas.microsoft.com/office/word/2018/wordml/cex" xmlns:w16cid="http://schemas.microsoft.com/office/word/2016/wordml/cid" xmlns:w16="http://schemas.microsoft.com/office/word/2018/wordml" xmlns:w16du="http://schemas.microsoft.com/office/word/2023/wordml/word16du" xmlns:w16sdtdh="http://schemas.microsoft.com/office/word/2020/wordml/sdtdatahash" xmlns:w16sdtfl="http://schemas.microsoft.com/office/word/2024/wordml/sdtformatlock" xmlns:w16se="http://schemas.microsoft.com/office/word/2015/wordml/symex" xmlns:wpg="http://schemas.microsoft.com/office/word/2010/wordprocessingGroup" xmlns:wpi="http://schemas.microsoft.com/office/word/2010/wordprocessingInk" xmlns:wne="http://schemas.microsoft.com/office/word/2006/wordml" xmlns:wps="http://schemas.microsoft.com/office/word/2010/wordprocessingShape" mc:Ignorable="w14 w15 w16se w16cid w16 w16cex w16sdtdh w16sdtfl w16du wp14">
+<w:ftr xmlns:wpc="http://schemas.microsoft.com/office/word/2010/wordprocessingCanvas" xmlns:cx="http://schemas.microsoft.com/office/drawing/2014/chartex" xmlns:cx1="http://schemas.microsoft.com/office/drawing/2015/9/8/chartex" xmlns:cx2="http://schemas.microsoft.com/office/drawing/2015/10/21/chartex" xmlns:cx3="http://schemas.microsoft.com/office/drawing/2016/5/9/chartex" xmlns:cx4="http://schemas.microsoft.com/office/drawing/2016/5/10/chartex" xmlns:cx5="http://schemas.microsoft.com/office/drawing/2016/5/11/chartex" xmlns:cx6="http://schemas.microsoft.com/office/drawing/2016/5/12/chartex" xmlns:cx7="http://schemas.microsoft.com/office/drawing/2016/5/13/chartex" xmlns:cx8="http://schemas.microsoft.com/office/drawing/2016/5/14/chartex" xmlns:mc="http://schemas.openxmlformats.org/markup-compatibility/2006" xmlns:aink="http://schemas.microsoft.com/office/drawing/2016/ink" xmlns:am3d="http://schemas.microsoft.com/office/drawing/2017/model3d" xmlns:o="urn:schemas-microsoft-com:office:office" xmlns:r="http://schemas.openxmlformats.org/officeDocument/2006/relationships" xmlns:m="http://schemas.openxmlformats.org/officeDocument/2006/math" xmlns:v="urn:schemas-microsoft-com:vml" xmlns:wp14="http://schemas.microsoft.com/office/word/2010/wordprocessingDrawing" xmlns:wp="http://schemas.openxmlformats.org/drawingml/2006/wordprocessingDrawing" xmlns:w10="urn:schemas-microsoft-com:office:word" xmlns:w="http://schemas.openxmlformats.org/wordprocessingml/2006/main" xmlns:w14="http://schemas.microsoft.com/office/word/2010/wordml" xmlns:w15="http://schemas.microsoft.com/office/word/2012/wordml" xmlns:w16cid="http://schemas.microsoft.com/office/word/2016/wordml/cid" xmlns:w16se="http://schemas.microsoft.com/office/word/2015/wordml/symex" xmlns:wpg="http://schemas.microsoft.com/office/word/2010/wordprocessingGroup" xmlns:wpi="http://schemas.microsoft.com/office/word/2010/wordprocessingInk" xmlns:wne="http://schemas.microsoft.com/office/word/2006/wordml" xmlns:wps="http://schemas.microsoft.com/office/word/2010/wordprocessingShape" mc:Ignorable="w14 w15 w16se w16cid wp14">
   <w:sdt>
     <w:sdtPr>
       <w:id w:val="1430625059"/>
@@ -7366,6 +7259,7 @@
         <w:docPartUnique/>
       </w:docPartObj>
     </w:sdtPr>
+    <w:sdtEndPr/>
     <w:sdtContent>
       <w:p>
         <w:pPr>
@@ -7421,7 +7315,7 @@
                 </wp:inline>
               </w:drawing>
             </mc:Choice>
-            <mc:Fallback>
+            <mc:Fallback xmlns:w16sdtfl="http://schemas.microsoft.com/office/word/2024/wordml/sdtformatlock" xmlns:w16sdtdh="http://schemas.microsoft.com/office/word/2020/wordml/sdtdatahash" xmlns:w16du="http://schemas.microsoft.com/office/word/2023/wordml/word16du" xmlns:w16="http://schemas.microsoft.com/office/word/2018/wordml" xmlns:w16cex="http://schemas.microsoft.com/office/word/2018/wordml/cex" xmlns:oel="http://schemas.microsoft.com/office/2019/extlst">
               <w:pict>
                 <v:shapetype w14:anchorId="32B99323" id="_x0000_t110" coordsize="21600,21600" o:spt="110" path="m10800,l,10800,10800,21600,21600,10800xe">
                   <v:stroke joinstyle="miter"/>
@@ -7467,7 +7361,7 @@
 </file>
 
 <file path=word/footnotes.xml><?xml version="1.0" encoding="utf-8"?>
-<w:footnotes xmlns:wpc="http://schemas.microsoft.com/office/word/2010/wordprocessingCanvas" xmlns:cx="http://schemas.microsoft.com/office/drawing/2014/chartex" xmlns:cx1="http://schemas.microsoft.com/office/drawing/2015/9/8/chartex" xmlns:cx2="http://schemas.microsoft.com/office/drawing/2015/10/21/chartex" xmlns:cx3="http://schemas.microsoft.com/office/drawing/2016/5/9/chartex" xmlns:cx4="http://schemas.microsoft.com/office/drawing/2016/5/10/chartex" xmlns:cx5="http://schemas.microsoft.com/office/drawing/2016/5/11/chartex" xmlns:cx6="http://schemas.microsoft.com/office/drawing/2016/5/12/chartex" xmlns:cx7="http://schemas.microsoft.com/office/drawing/2016/5/13/chartex" xmlns:cx8="http://schemas.microsoft.com/office/drawing/2016/5/14/chartex" xmlns:mc="http://schemas.openxmlformats.org/markup-compatibility/2006" xmlns:aink="http://schemas.microsoft.com/office/drawing/2016/ink" xmlns:am3d="http://schemas.microsoft.com/office/drawing/2017/model3d" xmlns:o="urn:schemas-microsoft-com:office:office" xmlns:oel="http://schemas.microsoft.com/office/2019/extlst" xmlns:r="http://schemas.openxmlformats.org/officeDocument/2006/relationships" xmlns:m="http://schemas.openxmlformats.org/officeDocument/2006/math" xmlns:v="urn:schemas-microsoft-com:vml" xmlns:wp14="http://schemas.microsoft.com/office/word/2010/wordprocessingDrawing" xmlns:wp="http://schemas.openxmlformats.org/drawingml/2006/wordprocessingDrawing" xmlns:w10="urn:schemas-microsoft-com:office:word" xmlns:w="http://schemas.openxmlformats.org/wordprocessingml/2006/main" xmlns:w14="http://schemas.microsoft.com/office/word/2010/wordml" xmlns:w15="http://schemas.microsoft.com/office/word/2012/wordml" xmlns:w16cex="http://schemas.microsoft.com/office/word/2018/wordml/cex" xmlns:w16cid="http://schemas.microsoft.com/office/word/2016/wordml/cid" xmlns:w16="http://schemas.microsoft.com/office/word/2018/wordml" xmlns:w16du="http://schemas.microsoft.com/office/word/2023/wordml/word16du" xmlns:w16sdtdh="http://schemas.microsoft.com/office/word/2020/wordml/sdtdatahash" xmlns:w16sdtfl="http://schemas.microsoft.com/office/word/2024/wordml/sdtformatlock" xmlns:w16se="http://schemas.microsoft.com/office/word/2015/wordml/symex" xmlns:wpg="http://schemas.microsoft.com/office/word/2010/wordprocessingGroup" xmlns:wpi="http://schemas.microsoft.com/office/word/2010/wordprocessingInk" xmlns:wne="http://schemas.microsoft.com/office/word/2006/wordml" xmlns:wps="http://schemas.microsoft.com/office/word/2010/wordprocessingShape" mc:Ignorable="w14 w15 w16se w16cid w16 w16cex w16sdtdh w16sdtfl w16du wp14">
+<w:footnotes xmlns:wpc="http://schemas.microsoft.com/office/word/2010/wordprocessingCanvas" xmlns:cx="http://schemas.microsoft.com/office/drawing/2014/chartex" xmlns:cx1="http://schemas.microsoft.com/office/drawing/2015/9/8/chartex" xmlns:cx2="http://schemas.microsoft.com/office/drawing/2015/10/21/chartex" xmlns:cx3="http://schemas.microsoft.com/office/drawing/2016/5/9/chartex" xmlns:cx4="http://schemas.microsoft.com/office/drawing/2016/5/10/chartex" xmlns:cx5="http://schemas.microsoft.com/office/drawing/2016/5/11/chartex" xmlns:cx6="http://schemas.microsoft.com/office/drawing/2016/5/12/chartex" xmlns:cx7="http://schemas.microsoft.com/office/drawing/2016/5/13/chartex" xmlns:cx8="http://schemas.microsoft.com/office/drawing/2016/5/14/chartex" xmlns:mc="http://schemas.openxmlformats.org/markup-compatibility/2006" xmlns:aink="http://schemas.microsoft.com/office/drawing/2016/ink" xmlns:am3d="http://schemas.microsoft.com/office/drawing/2017/model3d" xmlns:o="urn:schemas-microsoft-com:office:office" xmlns:r="http://schemas.openxmlformats.org/officeDocument/2006/relationships" xmlns:m="http://schemas.openxmlformats.org/officeDocument/2006/math" xmlns:v="urn:schemas-microsoft-com:vml" xmlns:wp14="http://schemas.microsoft.com/office/word/2010/wordprocessingDrawing" xmlns:wp="http://schemas.openxmlformats.org/drawingml/2006/wordprocessingDrawing" xmlns:w10="urn:schemas-microsoft-com:office:word" xmlns:w="http://schemas.openxmlformats.org/wordprocessingml/2006/main" xmlns:w14="http://schemas.microsoft.com/office/word/2010/wordml" xmlns:w15="http://schemas.microsoft.com/office/word/2012/wordml" xmlns:w16cid="http://schemas.microsoft.com/office/word/2016/wordml/cid" xmlns:w16se="http://schemas.microsoft.com/office/word/2015/wordml/symex" xmlns:wpg="http://schemas.microsoft.com/office/word/2010/wordprocessingGroup" xmlns:wpi="http://schemas.microsoft.com/office/word/2010/wordprocessingInk" xmlns:wne="http://schemas.microsoft.com/office/word/2006/wordml" xmlns:wps="http://schemas.microsoft.com/office/word/2010/wordprocessingShape" mc:Ignorable="w14 w15 w16se w16cid wp14">
   <w:footnote w:type="separator" w:id="-1">
     <w:p>
       <w:pPr>
@@ -7492,7 +7386,7 @@
 </file>
 
 <file path=word/numbering.xml><?xml version="1.0" encoding="utf-8"?>
-<w:numbering xmlns:wpc="http://schemas.microsoft.com/office/word/2010/wordprocessingCanvas" xmlns:cx="http://schemas.microsoft.com/office/drawing/2014/chartex" xmlns:cx1="http://schemas.microsoft.com/office/drawing/2015/9/8/chartex" xmlns:cx2="http://schemas.microsoft.com/office/drawing/2015/10/21/chartex" xmlns:cx3="http://schemas.microsoft.com/office/drawing/2016/5/9/chartex" xmlns:cx4="http://schemas.microsoft.com/office/drawing/2016/5/10/chartex" xmlns:cx5="http://schemas.microsoft.com/office/drawing/2016/5/11/chartex" xmlns:cx6="http://schemas.microsoft.com/office/drawing/2016/5/12/chartex" xmlns:cx7="http://schemas.microsoft.com/office/drawing/2016/5/13/chartex" xmlns:cx8="http://schemas.microsoft.com/office/drawing/2016/5/14/chartex" xmlns:mc="http://schemas.openxmlformats.org/markup-compatibility/2006" xmlns:aink="http://schemas.microsoft.com/office/drawing/2016/ink" xmlns:am3d="http://schemas.microsoft.com/office/drawing/2017/model3d" xmlns:o="urn:schemas-microsoft-com:office:office" xmlns:oel="http://schemas.microsoft.com/office/2019/extlst" xmlns:r="http://schemas.openxmlformats.org/officeDocument/2006/relationships" xmlns:m="http://schemas.openxmlformats.org/officeDocument/2006/math" xmlns:v="urn:schemas-microsoft-com:vml" xmlns:wp14="http://schemas.microsoft.com/office/word/2010/wordprocessingDrawing" xmlns:wp="http://schemas.openxmlformats.org/drawingml/2006/wordprocessingDrawing" xmlns:w10="urn:schemas-microsoft-com:office:word" xmlns:w="http://schemas.openxmlformats.org/wordprocessingml/2006/main" xmlns:w14="http://schemas.microsoft.com/office/word/2010/wordml" xmlns:w15="http://schemas.microsoft.com/office/word/2012/wordml" xmlns:w16cex="http://schemas.microsoft.com/office/word/2018/wordml/cex" xmlns:w16cid="http://schemas.microsoft.com/office/word/2016/wordml/cid" xmlns:w16="http://schemas.microsoft.com/office/word/2018/wordml" xmlns:w16du="http://schemas.microsoft.com/office/word/2023/wordml/word16du" xmlns:w16sdtdh="http://schemas.microsoft.com/office/word/2020/wordml/sdtdatahash" xmlns:w16sdtfl="http://schemas.microsoft.com/office/word/2024/wordml/sdtformatlock" xmlns:w16se="http://schemas.microsoft.com/office/word/2015/wordml/symex" xmlns:wpg="http://schemas.microsoft.com/office/word/2010/wordprocessingGroup" xmlns:wpi="http://schemas.microsoft.com/office/word/2010/wordprocessingInk" xmlns:wne="http://schemas.microsoft.com/office/word/2006/wordml" xmlns:wps="http://schemas.microsoft.com/office/word/2010/wordprocessingShape" mc:Ignorable="w14 w15 w16se w16cid w16 w16cex w16sdtdh w16sdtfl w16du wp14">
+<w:numbering xmlns:wpc="http://schemas.microsoft.com/office/word/2010/wordprocessingCanvas" xmlns:cx="http://schemas.microsoft.com/office/drawing/2014/chartex" xmlns:cx1="http://schemas.microsoft.com/office/drawing/2015/9/8/chartex" xmlns:cx2="http://schemas.microsoft.com/office/drawing/2015/10/21/chartex" xmlns:cx3="http://schemas.microsoft.com/office/drawing/2016/5/9/chartex" xmlns:cx4="http://schemas.microsoft.com/office/drawing/2016/5/10/chartex" xmlns:cx5="http://schemas.microsoft.com/office/drawing/2016/5/11/chartex" xmlns:cx6="http://schemas.microsoft.com/office/drawing/2016/5/12/chartex" xmlns:cx7="http://schemas.microsoft.com/office/drawing/2016/5/13/chartex" xmlns:cx8="http://schemas.microsoft.com/office/drawing/2016/5/14/chartex" xmlns:mc="http://schemas.openxmlformats.org/markup-compatibility/2006" xmlns:aink="http://schemas.microsoft.com/office/drawing/2016/ink" xmlns:am3d="http://schemas.microsoft.com/office/drawing/2017/model3d" xmlns:o="urn:schemas-microsoft-com:office:office" xmlns:r="http://schemas.openxmlformats.org/officeDocument/2006/relationships" xmlns:m="http://schemas.openxmlformats.org/officeDocument/2006/math" xmlns:v="urn:schemas-microsoft-com:vml" xmlns:wp14="http://schemas.microsoft.com/office/word/2010/wordprocessingDrawing" xmlns:wp="http://schemas.openxmlformats.org/drawingml/2006/wordprocessingDrawing" xmlns:w10="urn:schemas-microsoft-com:office:word" xmlns:w="http://schemas.openxmlformats.org/wordprocessingml/2006/main" xmlns:w14="http://schemas.microsoft.com/office/word/2010/wordml" xmlns:w15="http://schemas.microsoft.com/office/word/2012/wordml" xmlns:w16cid="http://schemas.microsoft.com/office/word/2016/wordml/cid" xmlns:w16se="http://schemas.microsoft.com/office/word/2015/wordml/symex" xmlns:wpg="http://schemas.microsoft.com/office/word/2010/wordprocessingGroup" xmlns:wpi="http://schemas.microsoft.com/office/word/2010/wordprocessingInk" xmlns:wne="http://schemas.microsoft.com/office/word/2006/wordml" xmlns:wps="http://schemas.microsoft.com/office/word/2010/wordprocessingShape" mc:Ignorable="w14 w15 w16se w16cid wp14">
   <w:abstractNum w:abstractNumId="0" w15:restartNumberingAfterBreak="0">
     <w:nsid w:val="01DE46C3"/>
     <w:multiLevelType w:val="hybridMultilevel"/>
@@ -11544,116 +11438,116 @@
       </w:rPr>
     </w:lvl>
   </w:abstractNum>
-  <w:num w:numId="1" w16cid:durableId="661931205">
+  <w:num w:numId="1">
     <w:abstractNumId w:val="25"/>
   </w:num>
-  <w:num w:numId="2" w16cid:durableId="1583293432">
+  <w:num w:numId="2">
     <w:abstractNumId w:val="2"/>
   </w:num>
-  <w:num w:numId="3" w16cid:durableId="1866673470">
+  <w:num w:numId="3">
     <w:abstractNumId w:val="26"/>
   </w:num>
-  <w:num w:numId="4" w16cid:durableId="950087646">
+  <w:num w:numId="4">
     <w:abstractNumId w:val="0"/>
   </w:num>
-  <w:num w:numId="5" w16cid:durableId="1310748910">
+  <w:num w:numId="5">
     <w:abstractNumId w:val="30"/>
   </w:num>
-  <w:num w:numId="6" w16cid:durableId="1086072245">
+  <w:num w:numId="6">
     <w:abstractNumId w:val="14"/>
   </w:num>
-  <w:num w:numId="7" w16cid:durableId="1071587191">
+  <w:num w:numId="7">
     <w:abstractNumId w:val="20"/>
   </w:num>
-  <w:num w:numId="8" w16cid:durableId="1103189597">
+  <w:num w:numId="8">
     <w:abstractNumId w:val="23"/>
   </w:num>
-  <w:num w:numId="9" w16cid:durableId="398334666">
+  <w:num w:numId="9">
     <w:abstractNumId w:val="28"/>
   </w:num>
-  <w:num w:numId="10" w16cid:durableId="502356181">
+  <w:num w:numId="10">
     <w:abstractNumId w:val="17"/>
   </w:num>
-  <w:num w:numId="11" w16cid:durableId="275138540">
+  <w:num w:numId="11">
     <w:abstractNumId w:val="24"/>
   </w:num>
-  <w:num w:numId="12" w16cid:durableId="262543441">
+  <w:num w:numId="12">
     <w:abstractNumId w:val="5"/>
   </w:num>
-  <w:num w:numId="13" w16cid:durableId="1078986716">
+  <w:num w:numId="13">
     <w:abstractNumId w:val="6"/>
   </w:num>
-  <w:num w:numId="14" w16cid:durableId="2103641395">
+  <w:num w:numId="14">
     <w:abstractNumId w:val="10"/>
   </w:num>
-  <w:num w:numId="15" w16cid:durableId="37361214">
+  <w:num w:numId="15">
     <w:abstractNumId w:val="4"/>
   </w:num>
-  <w:num w:numId="16" w16cid:durableId="1776050614">
+  <w:num w:numId="16">
     <w:abstractNumId w:val="15"/>
   </w:num>
-  <w:num w:numId="17" w16cid:durableId="261374709">
+  <w:num w:numId="17">
     <w:abstractNumId w:val="34"/>
   </w:num>
-  <w:num w:numId="18" w16cid:durableId="697387153">
+  <w:num w:numId="18">
     <w:abstractNumId w:val="9"/>
   </w:num>
-  <w:num w:numId="19" w16cid:durableId="1111822502">
+  <w:num w:numId="19">
     <w:abstractNumId w:val="29"/>
   </w:num>
-  <w:num w:numId="20" w16cid:durableId="411047470">
+  <w:num w:numId="20">
     <w:abstractNumId w:val="3"/>
   </w:num>
-  <w:num w:numId="21" w16cid:durableId="1907521828">
+  <w:num w:numId="21">
     <w:abstractNumId w:val="13"/>
   </w:num>
-  <w:num w:numId="22" w16cid:durableId="969476027">
+  <w:num w:numId="22">
     <w:abstractNumId w:val="16"/>
   </w:num>
-  <w:num w:numId="23" w16cid:durableId="1572041739">
+  <w:num w:numId="23">
     <w:abstractNumId w:val="11"/>
   </w:num>
-  <w:num w:numId="24" w16cid:durableId="1527938576">
+  <w:num w:numId="24">
     <w:abstractNumId w:val="33"/>
   </w:num>
-  <w:num w:numId="25" w16cid:durableId="1206018783">
+  <w:num w:numId="25">
     <w:abstractNumId w:val="19"/>
   </w:num>
-  <w:num w:numId="26" w16cid:durableId="2074573190">
+  <w:num w:numId="26">
     <w:abstractNumId w:val="22"/>
   </w:num>
-  <w:num w:numId="27" w16cid:durableId="1936401698">
+  <w:num w:numId="27">
     <w:abstractNumId w:val="12"/>
   </w:num>
-  <w:num w:numId="28" w16cid:durableId="1019893048">
+  <w:num w:numId="28">
     <w:abstractNumId w:val="1"/>
   </w:num>
-  <w:num w:numId="29" w16cid:durableId="825819586">
+  <w:num w:numId="29">
     <w:abstractNumId w:val="7"/>
   </w:num>
-  <w:num w:numId="30" w16cid:durableId="1320766214">
+  <w:num w:numId="30">
     <w:abstractNumId w:val="21"/>
   </w:num>
-  <w:num w:numId="31" w16cid:durableId="1709527300">
+  <w:num w:numId="31">
     <w:abstractNumId w:val="18"/>
   </w:num>
-  <w:num w:numId="32" w16cid:durableId="154415202">
+  <w:num w:numId="32">
     <w:abstractNumId w:val="27"/>
   </w:num>
-  <w:num w:numId="33" w16cid:durableId="67926315">
+  <w:num w:numId="33">
     <w:abstractNumId w:val="8"/>
   </w:num>
-  <w:num w:numId="34" w16cid:durableId="1328052358">
+  <w:num w:numId="34">
     <w:abstractNumId w:val="31"/>
   </w:num>
-  <w:num w:numId="35" w16cid:durableId="2093969161">
+  <w:num w:numId="35">
     <w:abstractNumId w:val="32"/>
   </w:num>
 </w:numbering>
 </file>
 
 <file path=word/styles.xml><?xml version="1.0" encoding="utf-8"?>
-<w:styles xmlns:mc="http://schemas.openxmlformats.org/markup-compatibility/2006" xmlns:r="http://schemas.openxmlformats.org/officeDocument/2006/relationships" xmlns:w="http://schemas.openxmlformats.org/wordprocessingml/2006/main" xmlns:w14="http://schemas.microsoft.com/office/word/2010/wordml" xmlns:w15="http://schemas.microsoft.com/office/word/2012/wordml" xmlns:w16cex="http://schemas.microsoft.com/office/word/2018/wordml/cex" xmlns:w16cid="http://schemas.microsoft.com/office/word/2016/wordml/cid" xmlns:w16="http://schemas.microsoft.com/office/word/2018/wordml" xmlns:w16du="http://schemas.microsoft.com/office/word/2023/wordml/word16du" xmlns:w16sdtdh="http://schemas.microsoft.com/office/word/2020/wordml/sdtdatahash" xmlns:w16sdtfl="http://schemas.microsoft.com/office/word/2024/wordml/sdtformatlock" xmlns:w16se="http://schemas.microsoft.com/office/word/2015/wordml/symex" mc:Ignorable="w14 w15 w16se w16cid w16 w16cex w16sdtdh w16sdtfl w16du">
+<w:styles xmlns:mc="http://schemas.openxmlformats.org/markup-compatibility/2006" xmlns:r="http://schemas.openxmlformats.org/officeDocument/2006/relationships" xmlns:w="http://schemas.openxmlformats.org/wordprocessingml/2006/main" xmlns:w14="http://schemas.microsoft.com/office/word/2010/wordml" xmlns:w15="http://schemas.microsoft.com/office/word/2012/wordml" xmlns:w16cid="http://schemas.microsoft.com/office/word/2016/wordml/cid" xmlns:w16se="http://schemas.microsoft.com/office/word/2015/wordml/symex" mc:Ignorable="w14 w15 w16se w16cid">
   <w:docDefaults>
     <w:rPrDefault>
       <w:rPr>
@@ -11671,7 +11565,7 @@
       </w:pPr>
     </w:pPrDefault>
   </w:docDefaults>
-  <w:latentStyles w:defLockedState="0" w:defUIPriority="99" w:defSemiHidden="0" w:defUnhideWhenUsed="0" w:defQFormat="0" w:count="376">
+  <w:latentStyles w:defLockedState="0" w:defUIPriority="99" w:defSemiHidden="0" w:defUnhideWhenUsed="0" w:defQFormat="0" w:count="375">
     <w:lsdException w:name="Normal" w:uiPriority="0" w:qFormat="1"/>
     <w:lsdException w:name="heading 1" w:uiPriority="9" w:qFormat="1"/>
     <w:lsdException w:name="heading 2" w:semiHidden="1" w:uiPriority="9" w:unhideWhenUsed="1" w:qFormat="1"/>
@@ -12047,7 +11941,6 @@
     <w:lsdException w:name="Smart Hyperlink" w:semiHidden="1" w:unhideWhenUsed="1"/>
     <w:lsdException w:name="Hashtag" w:semiHidden="1" w:unhideWhenUsed="1"/>
     <w:lsdException w:name="Unresolved Mention" w:semiHidden="1" w:unhideWhenUsed="1"/>
-    <w:lsdException w:name="Smart Link" w:semiHidden="1" w:unhideWhenUsed="1"/>
   </w:latentStyles>
   <w:style w:type="paragraph" w:default="1" w:styleId="Normal">
     <w:name w:val="Normal"/>
@@ -12249,6 +12142,7 @@
   <w:style w:type="character" w:default="1" w:styleId="Fuentedeprrafopredeter">
     <w:name w:val="Default Paragraph Font"/>
     <w:uiPriority w:val="1"/>
+    <w:semiHidden/>
     <w:unhideWhenUsed/>
   </w:style>
   <w:style w:type="table" w:default="1" w:styleId="Tablanormal">
@@ -13042,7 +12936,7 @@
 </file>
 
 <file path=customXml/itemProps1.xml><?xml version="1.0" encoding="utf-8"?>
-<ds:datastoreItem xmlns:ds="http://schemas.openxmlformats.org/officeDocument/2006/customXml" ds:itemID="{4065E478-6F18-4863-A8EA-2BA68AAB49A6}">
+<ds:datastoreItem xmlns:ds="http://schemas.openxmlformats.org/officeDocument/2006/customXml" ds:itemID="{DDAACA24-3A6C-4042-BBB0-1AA5A7BC27BB}">
   <ds:schemaRefs>
     <ds:schemaRef ds:uri="http://schemas.openxmlformats.org/officeDocument/2006/bibliography"/>
   </ds:schemaRefs>

</xml_diff>